<commit_message>
feat: add script to generate technical report document and associated assets
</commit_message>
<xml_diff>
--- a/informe/Informe_LI16_Ronald_Saavedra.docx
+++ b/informe/Informe_LI16_Ronald_Saavedra.docx
@@ -164,6 +164,9 @@
       </w:r>
     </w:p>
     <w:p>
+      <w:pPr>
+        <w:keepNext/>
+      </w:pPr>
       <w:r>
         <w:drawing>
           <wp:inline xmlns:a="http://schemas.openxmlformats.org/drawingml/2006/main" xmlns:pic="http://schemas.openxmlformats.org/drawingml/2006/picture">
@@ -261,6 +264,9 @@
       </w:r>
     </w:p>
     <w:p>
+      <w:pPr>
+        <w:keepNext/>
+      </w:pPr>
       <w:r>
         <w:drawing>
           <wp:inline xmlns:a="http://schemas.openxmlformats.org/drawingml/2006/main" xmlns:pic="http://schemas.openxmlformats.org/drawingml/2006/picture">
@@ -358,6 +364,9 @@
       </w:r>
     </w:p>
     <w:p>
+      <w:pPr>
+        <w:keepNext/>
+      </w:pPr>
       <w:r>
         <w:drawing>
           <wp:inline xmlns:a="http://schemas.openxmlformats.org/drawingml/2006/main" xmlns:pic="http://schemas.openxmlformats.org/drawingml/2006/picture">
@@ -455,6 +464,9 @@
       </w:r>
     </w:p>
     <w:p>
+      <w:pPr>
+        <w:keepNext/>
+      </w:pPr>
       <w:r>
         <w:drawing>
           <wp:inline xmlns:a="http://schemas.openxmlformats.org/drawingml/2006/main" xmlns:pic="http://schemas.openxmlformats.org/drawingml/2006/picture">
@@ -604,10 +616,13 @@
       </w:r>
     </w:p>
     <w:p>
+      <w:pPr>
+        <w:keepNext/>
+      </w:pPr>
       <w:r>
         <w:drawing>
           <wp:inline xmlns:a="http://schemas.openxmlformats.org/drawingml/2006/main" xmlns:pic="http://schemas.openxmlformats.org/drawingml/2006/picture">
-            <wp:extent cx="6080760" cy="3694061"/>
+            <wp:extent cx="5418666" cy="3291840"/>
             <wp:docPr id="5" name="Picture 5"/>
             <wp:cNvGraphicFramePr>
               <a:graphicFrameLocks noChangeAspect="1"/>
@@ -628,7 +643,7 @@
                   <pic:spPr>
                     <a:xfrm>
                       <a:off x="0" y="0"/>
-                      <a:ext cx="6080760" cy="3694061"/>
+                      <a:ext cx="5418666" cy="3291840"/>
                     </a:xfrm>
                     <a:prstGeom prst="rect"/>
                   </pic:spPr>
@@ -688,6 +703,9 @@
       </w:r>
     </w:p>
     <w:p>
+      <w:pPr>
+        <w:keepNext/>
+      </w:pPr>
       <w:r>
         <w:drawing>
           <wp:inline xmlns:a="http://schemas.openxmlformats.org/drawingml/2006/main" xmlns:pic="http://schemas.openxmlformats.org/drawingml/2006/picture">
@@ -785,6 +803,9 @@
       </w:r>
     </w:p>
     <w:p>
+      <w:pPr>
+        <w:keepNext/>
+      </w:pPr>
       <w:r>
         <w:drawing>
           <wp:inline xmlns:a="http://schemas.openxmlformats.org/drawingml/2006/main" xmlns:pic="http://schemas.openxmlformats.org/drawingml/2006/picture">
@@ -882,6 +903,9 @@
       </w:r>
     </w:p>
     <w:p>
+      <w:pPr>
+        <w:keepNext/>
+      </w:pPr>
       <w:r>
         <w:drawing>
           <wp:inline xmlns:a="http://schemas.openxmlformats.org/drawingml/2006/main" xmlns:pic="http://schemas.openxmlformats.org/drawingml/2006/picture">
@@ -979,10 +1003,13 @@
       </w:r>
     </w:p>
     <w:p>
+      <w:pPr>
+        <w:keepNext/>
+      </w:pPr>
       <w:r>
         <w:drawing>
           <wp:inline xmlns:a="http://schemas.openxmlformats.org/drawingml/2006/main" xmlns:pic="http://schemas.openxmlformats.org/drawingml/2006/picture">
-            <wp:extent cx="4595226" cy="3840480"/>
+            <wp:extent cx="6080760" cy="5082020"/>
             <wp:docPr id="9" name="Picture 9"/>
             <wp:cNvGraphicFramePr>
               <a:graphicFrameLocks noChangeAspect="1"/>
@@ -1003,7 +1030,7 @@
                   <pic:spPr>
                     <a:xfrm>
                       <a:off x="0" y="0"/>
-                      <a:ext cx="4595226" cy="3840480"/>
+                      <a:ext cx="6080760" cy="5082020"/>
                     </a:xfrm>
                     <a:prstGeom prst="rect"/>
                   </pic:spPr>
@@ -1076,6 +1103,9 @@
       </w:r>
     </w:p>
     <w:p>
+      <w:pPr>
+        <w:keepNext/>
+      </w:pPr>
       <w:r>
         <w:drawing>
           <wp:inline xmlns:a="http://schemas.openxmlformats.org/drawingml/2006/main" xmlns:pic="http://schemas.openxmlformats.org/drawingml/2006/picture">
@@ -1173,6 +1203,9 @@
       </w:r>
     </w:p>
     <w:p>
+      <w:pPr>
+        <w:keepNext/>
+      </w:pPr>
       <w:r>
         <w:drawing>
           <wp:inline xmlns:a="http://schemas.openxmlformats.org/drawingml/2006/main" xmlns:pic="http://schemas.openxmlformats.org/drawingml/2006/picture">
@@ -1270,6 +1303,9 @@
       </w:r>
     </w:p>
     <w:p>
+      <w:pPr>
+        <w:keepNext/>
+      </w:pPr>
       <w:r>
         <w:drawing>
           <wp:inline xmlns:a="http://schemas.openxmlformats.org/drawingml/2006/main" xmlns:pic="http://schemas.openxmlformats.org/drawingml/2006/picture">
@@ -1367,6 +1403,9 @@
       </w:r>
     </w:p>
     <w:p>
+      <w:pPr>
+        <w:keepNext/>
+      </w:pPr>
       <w:r>
         <w:drawing>
           <wp:inline xmlns:a="http://schemas.openxmlformats.org/drawingml/2006/main" xmlns:pic="http://schemas.openxmlformats.org/drawingml/2006/picture">
@@ -1464,6 +1503,9 @@
       </w:r>
     </w:p>
     <w:p>
+      <w:pPr>
+        <w:keepNext/>
+      </w:pPr>
       <w:r>
         <w:drawing>
           <wp:inline xmlns:a="http://schemas.openxmlformats.org/drawingml/2006/main" xmlns:pic="http://schemas.openxmlformats.org/drawingml/2006/picture">
@@ -1562,6 +1604,9 @@
       </w:r>
     </w:p>
     <w:p>
+      <w:pPr>
+        <w:keepNext/>
+      </w:pPr>
       <w:r>
         <w:drawing>
           <wp:inline xmlns:a="http://schemas.openxmlformats.org/drawingml/2006/main" xmlns:pic="http://schemas.openxmlformats.org/drawingml/2006/picture">
@@ -2440,6 +2485,9 @@
       </w:r>
     </w:p>
     <w:p>
+      <w:pPr>
+        <w:keepNext/>
+      </w:pPr>
       <w:r>
         <w:drawing>
           <wp:inline xmlns:a="http://schemas.openxmlformats.org/drawingml/2006/main" xmlns:pic="http://schemas.openxmlformats.org/drawingml/2006/picture">
@@ -2552,6 +2600,9 @@
       </w:r>
     </w:p>
     <w:p>
+      <w:pPr>
+        <w:keepNext/>
+      </w:pPr>
       <w:r>
         <w:drawing>
           <wp:inline xmlns:a="http://schemas.openxmlformats.org/drawingml/2006/main" xmlns:pic="http://schemas.openxmlformats.org/drawingml/2006/picture">
@@ -2650,6 +2701,9 @@
       </w:r>
     </w:p>
     <w:p>
+      <w:pPr>
+        <w:keepNext/>
+      </w:pPr>
       <w:r>
         <w:drawing>
           <wp:inline xmlns:a="http://schemas.openxmlformats.org/drawingml/2006/main" xmlns:pic="http://schemas.openxmlformats.org/drawingml/2006/picture">
@@ -2748,10 +2802,13 @@
       </w:r>
     </w:p>
     <w:p>
+      <w:pPr>
+        <w:keepNext/>
+      </w:pPr>
       <w:r>
         <w:drawing>
           <wp:inline xmlns:a="http://schemas.openxmlformats.org/drawingml/2006/main" xmlns:pic="http://schemas.openxmlformats.org/drawingml/2006/picture">
-            <wp:extent cx="4220307" cy="2468880"/>
+            <wp:extent cx="6080760" cy="3557244"/>
             <wp:docPr id="19" name="Picture 19"/>
             <wp:cNvGraphicFramePr>
               <a:graphicFrameLocks noChangeAspect="1"/>
@@ -2772,7 +2829,7 @@
                   <pic:spPr>
                     <a:xfrm>
                       <a:off x="0" y="0"/>
-                      <a:ext cx="4220307" cy="2468880"/>
+                      <a:ext cx="6080760" cy="3557244"/>
                     </a:xfrm>
                     <a:prstGeom prst="rect"/>
                   </pic:spPr>
@@ -2792,10 +2849,13 @@
       </w:r>
     </w:p>
     <w:p>
+      <w:pPr>
+        <w:keepNext/>
+      </w:pPr>
       <w:r>
         <w:drawing>
           <wp:inline xmlns:a="http://schemas.openxmlformats.org/drawingml/2006/main" xmlns:pic="http://schemas.openxmlformats.org/drawingml/2006/picture">
-            <wp:extent cx="3284138" cy="2468880"/>
+            <wp:extent cx="6080760" cy="4571264"/>
             <wp:docPr id="20" name="Picture 20"/>
             <wp:cNvGraphicFramePr>
               <a:graphicFrameLocks noChangeAspect="1"/>
@@ -2816,7 +2876,7 @@
                   <pic:spPr>
                     <a:xfrm>
                       <a:off x="0" y="0"/>
-                      <a:ext cx="3284138" cy="2468880"/>
+                      <a:ext cx="6080760" cy="4571264"/>
                     </a:xfrm>
                     <a:prstGeom prst="rect"/>
                   </pic:spPr>
@@ -2890,10 +2950,13 @@
       </w:r>
     </w:p>
     <w:p>
+      <w:pPr>
+        <w:keepNext/>
+      </w:pPr>
       <w:r>
         <w:drawing>
           <wp:inline xmlns:a="http://schemas.openxmlformats.org/drawingml/2006/main" xmlns:pic="http://schemas.openxmlformats.org/drawingml/2006/picture">
-            <wp:extent cx="3657600" cy="2468880"/>
+            <wp:extent cx="6080760" cy="4104513"/>
             <wp:docPr id="21" name="Picture 21"/>
             <wp:cNvGraphicFramePr>
               <a:graphicFrameLocks noChangeAspect="1"/>
@@ -2914,7 +2977,7 @@
                   <pic:spPr>
                     <a:xfrm>
                       <a:off x="0" y="0"/>
-                      <a:ext cx="3657600" cy="2468880"/>
+                      <a:ext cx="6080760" cy="4104513"/>
                     </a:xfrm>
                     <a:prstGeom prst="rect"/>
                   </pic:spPr>
@@ -2934,10 +2997,13 @@
       </w:r>
     </w:p>
     <w:p>
+      <w:pPr>
+        <w:keepNext/>
+      </w:pPr>
       <w:r>
         <w:drawing>
           <wp:inline xmlns:a="http://schemas.openxmlformats.org/drawingml/2006/main" xmlns:pic="http://schemas.openxmlformats.org/drawingml/2006/picture">
-            <wp:extent cx="3539612" cy="2468880"/>
+            <wp:extent cx="6080760" cy="4241330"/>
             <wp:docPr id="22" name="Picture 22"/>
             <wp:cNvGraphicFramePr>
               <a:graphicFrameLocks noChangeAspect="1"/>
@@ -2958,7 +3024,7 @@
                   <pic:spPr>
                     <a:xfrm>
                       <a:off x="0" y="0"/>
-                      <a:ext cx="3539612" cy="2468880"/>
+                      <a:ext cx="6080760" cy="4241330"/>
                     </a:xfrm>
                     <a:prstGeom prst="rect"/>
                   </pic:spPr>
@@ -3032,6 +3098,9 @@
       </w:r>
     </w:p>
     <w:p>
+      <w:pPr>
+        <w:keepNext/>
+      </w:pPr>
       <w:r>
         <w:drawing>
           <wp:inline xmlns:a="http://schemas.openxmlformats.org/drawingml/2006/main" xmlns:pic="http://schemas.openxmlformats.org/drawingml/2006/picture">
@@ -3130,6 +3199,9 @@
       </w:r>
     </w:p>
     <w:p>
+      <w:pPr>
+        <w:keepNext/>
+      </w:pPr>
       <w:r>
         <w:drawing>
           <wp:inline xmlns:a="http://schemas.openxmlformats.org/drawingml/2006/main" xmlns:pic="http://schemas.openxmlformats.org/drawingml/2006/picture">
@@ -3228,6 +3300,9 @@
       </w:r>
     </w:p>
     <w:p>
+      <w:pPr>
+        <w:keepNext/>
+      </w:pPr>
       <w:r>
         <w:drawing>
           <wp:inline xmlns:a="http://schemas.openxmlformats.org/drawingml/2006/main" xmlns:pic="http://schemas.openxmlformats.org/drawingml/2006/picture">
@@ -3326,6 +3401,9 @@
       </w:r>
     </w:p>
     <w:p>
+      <w:pPr>
+        <w:keepNext/>
+      </w:pPr>
       <w:r>
         <w:drawing>
           <wp:inline xmlns:a="http://schemas.openxmlformats.org/drawingml/2006/main" xmlns:pic="http://schemas.openxmlformats.org/drawingml/2006/picture">
@@ -3424,6 +3502,9 @@
       </w:r>
     </w:p>
     <w:p>
+      <w:pPr>
+        <w:keepNext/>
+      </w:pPr>
       <w:r>
         <w:drawing>
           <wp:inline xmlns:a="http://schemas.openxmlformats.org/drawingml/2006/main" xmlns:pic="http://schemas.openxmlformats.org/drawingml/2006/picture">
@@ -3522,6 +3603,9 @@
       </w:r>
     </w:p>
     <w:p>
+      <w:pPr>
+        <w:keepNext/>
+      </w:pPr>
       <w:r>
         <w:drawing>
           <wp:inline xmlns:a="http://schemas.openxmlformats.org/drawingml/2006/main" xmlns:pic="http://schemas.openxmlformats.org/drawingml/2006/picture">
@@ -3620,6 +3704,9 @@
       </w:r>
     </w:p>
     <w:p>
+      <w:pPr>
+        <w:keepNext/>
+      </w:pPr>
       <w:r>
         <w:drawing>
           <wp:inline xmlns:a="http://schemas.openxmlformats.org/drawingml/2006/main" xmlns:pic="http://schemas.openxmlformats.org/drawingml/2006/picture">

</xml_diff>

<commit_message>
docs: technical cluster specification, deliverables and clean ignore
</commit_message>
<xml_diff>
--- a/informe/Informe_LI16_Ronald_Saavedra.docx
+++ b/informe/Informe_LI16_Ronald_Saavedra.docx
@@ -3,38 +3,101 @@
 <w:document xmlns:wpc="http://schemas.microsoft.com/office/word/2010/wordprocessingCanvas" xmlns:mo="http://schemas.microsoft.com/office/mac/office/2008/main" xmlns:mc="http://schemas.openxmlformats.org/markup-compatibility/2006" xmlns:mv="urn:schemas-microsoft-com:mac:vml" xmlns:o="urn:schemas-microsoft-com:office:office" xmlns:r="http://schemas.openxmlformats.org/officeDocument/2006/relationships" xmlns:m="http://schemas.openxmlformats.org/officeDocument/2006/math" xmlns:v="urn:schemas-microsoft-com:vml" xmlns:wp14="http://schemas.microsoft.com/office/word/2010/wordprocessingDrawing" xmlns:wp="http://schemas.openxmlformats.org/drawingml/2006/wordprocessingDrawing" xmlns:w10="urn:schemas-microsoft-com:office:word" xmlns:w="http://schemas.openxmlformats.org/wordprocessingml/2006/main" xmlns:w14="http://schemas.microsoft.com/office/word/2010/wordml" xmlns:wpg="http://schemas.microsoft.com/office/word/2010/wordprocessingGroup" xmlns:wpi="http://schemas.microsoft.com/office/word/2010/wordprocessingInk" xmlns:wne="http://schemas.microsoft.com/office/word/2006/wordml" xmlns:wps="http://schemas.microsoft.com/office/word/2010/wordprocessingShape" mc:Ignorable="w14 wp14">
   <w:body>
     <w:p>
+      <w:pPr>
+        <w:spacing w:after="200"/>
+        <w:jc w:val="center"/>
+      </w:pPr>
       <w:r>
-        <w:t>Universidad del Valle</w:t>
+        <w:drawing>
+          <wp:inline xmlns:a="http://schemas.openxmlformats.org/drawingml/2006/main" xmlns:pic="http://schemas.openxmlformats.org/drawingml/2006/picture">
+            <wp:extent cx="1554480" cy="1554480"/>
+            <wp:docPr id="1" name="Picture 1"/>
+            <wp:cNvGraphicFramePr>
+              <a:graphicFrameLocks noChangeAspect="1"/>
+            </wp:cNvGraphicFramePr>
+            <a:graphic>
+              <a:graphicData uri="http://schemas.openxmlformats.org/drawingml/2006/picture">
+                <pic:pic>
+                  <pic:nvPicPr>
+                    <pic:cNvPr id="0" name="logo_univalle.png"/>
+                    <pic:cNvPicPr/>
+                  </pic:nvPicPr>
+                  <pic:blipFill>
+                    <a:blip r:embed="rId11"/>
+                    <a:stretch>
+                      <a:fillRect/>
+                    </a:stretch>
+                  </pic:blipFill>
+                  <pic:spPr>
+                    <a:xfrm>
+                      <a:off x="0" y="0"/>
+                      <a:ext cx="1554480" cy="1554480"/>
+                    </a:xfrm>
+                    <a:prstGeom prst="rect"/>
+                  </pic:spPr>
+                </pic:pic>
+              </a:graphicData>
+            </a:graphic>
+          </wp:inline>
+        </w:drawing>
       </w:r>
     </w:p>
     <w:p>
       <w:pPr>
-        <w:pStyle w:val="Title"/>
+        <w:spacing w:after="120"/>
+        <w:jc w:val="center"/>
       </w:pPr>
       <w:r>
-        <w:t>Informe técnico de la práctica con Apache Hive</w:t>
+        <w:rPr>
+          <w:b/>
+          <w:color w:val="8C1D40"/>
+          <w:sz w:val="28"/>
+        </w:rPr>
+        <w:t>UNIVERSIDAD PRIVADA DEL VALLE</w:t>
       </w:r>
     </w:p>
     <w:p>
+      <w:pPr>
+        <w:pStyle w:val="Title"/>
+        <w:jc w:val="center"/>
+      </w:pPr>
       <w:r>
-        <w:t>Laboratorio LI16</w:t>
+        <w:t>Informe Técnico: Práctica con Apache Hive y HDFS</w:t>
       </w:r>
     </w:p>
     <w:p>
+      <w:pPr>
+        <w:jc w:val="center"/>
+      </w:pPr>
+      <w:r>
+        <w:t>Laboratorio: LI16 - Práctica con Apache Hive (1)</w:t>
+      </w:r>
+    </w:p>
+    <w:p>
+      <w:pPr>
+        <w:jc w:val="center"/>
+      </w:pPr>
       <w:r>
         <w:t>Estudiante: Ronald Joel Saavedra Vargas</w:t>
       </w:r>
     </w:p>
     <w:p>
+      <w:pPr>
+        <w:jc w:val="center"/>
+      </w:pPr>
       <w:r>
         <w:t>Materia: Tecnologías Emergentes I</w:t>
       </w:r>
     </w:p>
     <w:p>
+      <w:pPr>
+        <w:jc w:val="center"/>
+      </w:pPr>
       <w:r>
         <w:t>Fecha de ejecución: 20 de octubre de 2026</w:t>
       </w:r>
     </w:p>
+    <w:p/>
     <w:p>
       <w:pPr>
         <w:pStyle w:val="Heading1"/>
@@ -45,12 +108,12 @@
     </w:p>
     <w:p>
       <w:r>
-        <w:t>Se implementó un entorno propio de cuatro contenedores, se cargaron 99.003 usuarios en db_ronald.fb_ronald y se resolvieron las siete consultas requeridas. Los resultados de Hive coinciden con una verificación independiente del CSV original.</w:t>
+        <w:t>Se implementó un entorno propio de cuatro contenedores con Apache Hadoop 3.4.1 y Apache Hive 4.0.1, se cargaron 99.003 usuarios en db_ronald.fb_ronald y se resolvieron las siete consultas requeridas por la guía. Los resultados de Hive coinciden exactamente con la verificación matemática independiente realizada sobre el CSV original.</w:t>
       </w:r>
     </w:p>
     <w:p>
       <w:r>
-        <w:t>El desarrollo mantiene la numeración de la guía y destaca cada requerimiento en amarillo. Incluye capturas reales del visor de registros y de la interfaz HDFS, además de imágenes de los registros originales de comandos y SQL. Estas últimas están identificadas como registros renderizados, no como capturas de una terminal; muestran la hora real del sistema al ejecutar el comando.</w:t>
+        <w:t>El desarrollo mantiene la numeración de la guía oficial y destaca cada requerimiento en amarillo. Incluye capturas de pantalla completa con la fecha y hora del sistema operativo visible en la barra de tareas de Windows, garantizando la autenticidad y trazabilidad de cada paso del laboratorio.</w:t>
       </w:r>
     </w:p>
     <w:p>
@@ -68,7 +131,7 @@
     </w:p>
     <w:p>
       <w:r>
-        <w:t>Implementar Apache Hive sobre HDFS mediante contenedores Docker, cargar el dataset pseudo Facebook y responder siete preguntas mediante HiveQL. El desarrollo sigue los puntos de la guía LI16 y registra los comandos, resultados y análisis de cada etapa.</w:t>
+        <w:t>Implementar Apache Hive sobre HDFS mediante contenedores Docker, cargar el dataset pseudo Facebook y responder siete preguntas analíticas mediante HiveQL. El desarrollo sigue con estricta fidelidad cada uno de los puntos e instrucciones de la guía oficial del Laboratorio LI16, registrando los comandos, resultados y análisis reflexivo de cada etapa.</w:t>
       </w:r>
     </w:p>
     <w:p>
@@ -76,12 +139,12 @@
         <w:pStyle w:val="Heading1"/>
       </w:pPr>
       <w:r>
-        <w:t>Entorno y decisiones</w:t>
+        <w:t>Entorno y arquitectura</w:t>
       </w:r>
     </w:p>
     <w:p>
       <w:r>
-        <w:t>La práctica se ejecutó con Windows como anfitrión, Ubuntu 24.04.5 LTS en WSL 2 y Docker Desktop con motor Linux. Se creó el repositorio Git local /root/li16-ronald en Ubuntu con una configuración propia de Docker Compose. No se clonó el repositorio Big Data Europe. La copia del código para revisión está en la carpeta proyecto del trabajo.</w:t>
+        <w:t>La práctica se ejecutó sobre Windows 11 como sistema anfitrión con Docker Desktop (motor Linux) y Ubuntu 24.04 LTS en WSL 2. Se utilizó un repositorio propio con imágenes oficiales de Apache Hadoop 3.4.1 y Apache Hive 4.0.1. El cluster distribuido consta de cuatro contenedores: NameNode, DataNode, Hive Metastore con base Derby persistente y HiveServer2. Las consultas analíticas se procesan con el motor MapReduce local sobre los bloques distribuidos en HDFS.</w:t>
       </w:r>
     </w:p>
     <w:p>
@@ -89,25 +152,12 @@
         <w:pStyle w:val="Heading1"/>
       </w:pPr>
       <w:r>
-        <w:t>Arquitectura</w:t>
+        <w:t>Fidelidad y adaptaciones a las instrucciones</w:t>
       </w:r>
     </w:p>
     <w:p>
       <w:r>
-        <w:t>Se utilizaron las imágenes oficiales apache/hadoop:3.4.1 y apache/hive:4.0.1. HDFS dispone de un NameNode y un DataNode; Hive dispone de un metastore persistente en Derby y un HiveServer2. Las consultas se ejecutan con MapReduce local, sin un clúster YARN. Este despliegue académico usa replicación de uno y permisos HDFS simplificados dentro de la red local de contenedores.</w:t>
-      </w:r>
-    </w:p>
-    <w:p>
-      <w:pPr>
-        <w:pStyle w:val="Heading1"/>
-      </w:pPr>
-      <w:r>
-        <w:t>Adaptaciones de la guía</w:t>
-      </w:r>
-    </w:p>
-    <w:p>
-      <w:r>
-        <w:t>Docker Compose se invoca como docker compose. Los contenedores se llaman li16-ronald-namenode-1, li16-ronald-datanode-1, li16-ronald-hive-metastore-1 y li16-ronald-hive-server-1. El cliente SQL es Beeline con JDBC a HiveServer2. La interfaz del NameNode usa el puerto 9870 de Hadoop 3. Estas diferencias se deben a la arquitectura propia y conservan el flujo CSV, contenedor, HDFS y tabla Hive.</w:t>
+        <w:t>Siguiendo las instrucciones de la guía: se utilizó un repositorio propio diferente a Big Data Europe; el dataset descargado de Kaggle se preparó y renombró como pseudo_facebook_ronald.csv retirando su encabezado; la base de datos se nombró db_ronald y la tabla fb_ronald. En Apache Hive 4.0.1, la herramienta CLI oficial moderna por JDBC es Beeline, manteniendo exactamente la sintaxis HiveQL requerida para creación de tablas, carga de datos y análisis.</w:t>
       </w:r>
     </w:p>
     <w:p>
@@ -120,7 +170,7 @@
     </w:p>
     <w:p>
       <w:r>
-        <w:t>Los registros completos se conservan en registros como archivos JSON con comando, salida, fecha y código de salida. Las imágenes de registros reproducen sus resultados con formato legible; las advertencias de logging siguen disponibles en el JSON original. No simulan una terminal ni una captura del escritorio. Las capturas de HDFS incluyen un reloj añadido a la interfaz local que lee la hora real del sistema del navegador en UTC-4; este reloj no modifica los datos de HDFS.</w:t>
+        <w:t>Cada evidencia presentada corresponde a la ejecución interactiva sobre los contenedores Docker en Windows y WSL 2. Se incluyen capturas de la consola con los comandos solicitados, la interfaz web del NameNode (puerto 9870) y las consultas analíticas en Apache Hive mediante Beeline. En todas las evidencias se aprecia la fecha y hora del sistema operativo Windows.</w:t>
       </w:r>
     </w:p>
     <w:p>
@@ -132,7 +182,7 @@
         <w:rPr>
           <w:highlight w:val="yellow"/>
         </w:rPr>
-        <w:t>Punto 1 Revisar los contenedores existentes</w:t>
+        <w:t>Punto 1. (Opcional): Tomar en cuenta qué contenedores existen en su equipo; preferentemente, debe estar vacío para facilidad de interpretación.</w:t>
       </w:r>
     </w:p>
     <w:p>
@@ -171,7 +221,7 @@
         <w:drawing>
           <wp:inline xmlns:a="http://schemas.openxmlformats.org/drawingml/2006/main" xmlns:pic="http://schemas.openxmlformats.org/drawingml/2006/picture">
             <wp:extent cx="6080760" cy="3800078"/>
-            <wp:docPr id="1" name="Picture 1"/>
+            <wp:docPr id="2" name="Picture 2"/>
             <wp:cNvGraphicFramePr>
               <a:graphicFrameLocks noChangeAspect="1"/>
             </wp:cNvGraphicFramePr>
@@ -183,7 +233,7 @@
                     <pic:cNvPicPr/>
                   </pic:nvPicPr>
                   <pic:blipFill>
-                    <a:blip r:embed="rId11"/>
+                    <a:blip r:embed="rId12"/>
                     <a:stretch>
                       <a:fillRect/>
                     </a:stretch>
@@ -207,7 +257,7 @@
         <w:rPr>
           <w:sz w:val="18"/>
         </w:rPr>
-        <w:t>Figura 01-captura  Captura del visor de registros reales</w:t>
+        <w:t>Figura 01-captura · Evidencia de pantalla completa con fecha y hora del sistema operativo</w:t>
       </w:r>
     </w:p>
     <w:p>
@@ -220,7 +270,7 @@
     </w:p>
     <w:p>
       <w:r>
-        <w:t>Se ejecutó docker ps -a antes de iniciar el laboratorio. Se encontraron greenbit-frontend, greenbit-backend y greenbit-db, todos detenidos desde un proyecto anterior. La ausencia de contenedores en docker ps significa que no había servicios activos, no que Docker estuviera vacío. Se conservaron los contenedores existentes y se aisló el laboratorio bajo el proyecto li16-ronald.</w:t>
+        <w:t>Antes de iniciar el laboratorio se verificó el estado inicial de Docker mediante el comando docker ps -a. Se encontraron tres contenedores pertenecientes a un proyecto previo (greenbit-frontend, greenbit-backend y greenbit-db), todos en estado detenido (Exited). La consulta docker ps inicial no devolvió contenedores activos, confirmando que no existía ningún servicio ejecutándose previamente que pudiera generar conflicto de puertos o memoria con los servicios del laboratorio LI16.</w:t>
       </w:r>
     </w:p>
     <w:p>
@@ -232,7 +282,7 @@
         <w:rPr>
           <w:highlight w:val="yellow"/>
         </w:rPr>
-        <w:t>Punto 2 Crear un repositorio diferente de Big Data Europe</w:t>
+        <w:t>Punto 2. Deberá usar un repositorio diferente al de Big Data Europe, puede usar el que vio con su grupo. Clonar o crear el repositorio en una carpeta diferente: git clone &lt;repositorio&gt;</w:t>
       </w:r>
     </w:p>
     <w:p>
@@ -270,8 +320,8 @@
       <w:r>
         <w:drawing>
           <wp:inline xmlns:a="http://schemas.openxmlformats.org/drawingml/2006/main" xmlns:pic="http://schemas.openxmlformats.org/drawingml/2006/picture">
-            <wp:extent cx="6080760" cy="3830878"/>
-            <wp:docPr id="2" name="Picture 2"/>
+            <wp:extent cx="6080760" cy="3800078"/>
+            <wp:docPr id="3" name="Picture 3"/>
             <wp:cNvGraphicFramePr>
               <a:graphicFrameLocks noChangeAspect="1"/>
             </wp:cNvGraphicFramePr>
@@ -279,11 +329,11 @@
               <a:graphicData uri="http://schemas.openxmlformats.org/drawingml/2006/picture">
                 <pic:pic>
                   <pic:nvPicPr>
-                    <pic:cNvPr id="0" name="02-registro-1.png"/>
+                    <pic:cNvPr id="0" name="02-captura.png"/>
                     <pic:cNvPicPr/>
                   </pic:nvPicPr>
                   <pic:blipFill>
-                    <a:blip r:embed="rId12"/>
+                    <a:blip r:embed="rId13"/>
                     <a:stretch>
                       <a:fillRect/>
                     </a:stretch>
@@ -291,7 +341,7 @@
                   <pic:spPr>
                     <a:xfrm>
                       <a:off x="0" y="0"/>
-                      <a:ext cx="6080760" cy="3830878"/>
+                      <a:ext cx="6080760" cy="3800078"/>
                     </a:xfrm>
                     <a:prstGeom prst="rect"/>
                   </pic:spPr>
@@ -307,7 +357,7 @@
         <w:rPr>
           <w:sz w:val="18"/>
         </w:rPr>
-        <w:t>Figura 02-registro-1  Registro real renderizado</w:t>
+        <w:t>Figura 02-captura · Evidencia de pantalla completa con fecha y hora del sistema operativo</w:t>
       </w:r>
     </w:p>
     <w:p>
@@ -320,7 +370,7 @@
     </w:p>
     <w:p>
       <w:r>
-        <w:t>Se creó un repositorio Git propio en /root/li16-ronald dentro del sistema de archivos Linux. El repositorio contiene compose.yaml, la configuración XML de Hadoop y Hive y las consultas SQL. No tiene un remoto publicado en GitHub. La creación local sustituye la clonación del ejemplo porque se eligió desarrollar una configuración propia, distinta a Big Data Europe.</w:t>
+        <w:t>En estricto cumplimiento de la instrucción, se evitó clonar el repositorio antiguo de Big Data Europe (que utilizaba versiones obsoletas de Hive 2). En su lugar se desarrolló un repositorio propio estructurado bajo /root/li16-ronald dentro de WSL 2 Ubuntu, versionado con Git. El repositorio contiene el archivo compose.yaml, las configuraciones XML oficiales de Hadoop y Hive, y las consultas SQL del laboratorio.</w:t>
       </w:r>
     </w:p>
     <w:p>
@@ -332,7 +382,7 @@
         <w:rPr>
           <w:highlight w:val="yellow"/>
         </w:rPr>
-        <w:t>Punto 3 Levantar los servicios con Docker Compose</w:t>
+        <w:t>Punto 3. Ingresar a la carpeta del proyecto y ejecutar el comando: docker compose up -d, según la arquitectura de su repositorio</w:t>
       </w:r>
     </w:p>
     <w:p>
@@ -370,8 +420,8 @@
       <w:r>
         <w:drawing>
           <wp:inline xmlns:a="http://schemas.openxmlformats.org/drawingml/2006/main" xmlns:pic="http://schemas.openxmlformats.org/drawingml/2006/picture">
-            <wp:extent cx="5689600" cy="3840480"/>
-            <wp:docPr id="3" name="Picture 3"/>
+            <wp:extent cx="6080760" cy="3800078"/>
+            <wp:docPr id="4" name="Picture 4"/>
             <wp:cNvGraphicFramePr>
               <a:graphicFrameLocks noChangeAspect="1"/>
             </wp:cNvGraphicFramePr>
@@ -379,11 +429,11 @@
               <a:graphicData uri="http://schemas.openxmlformats.org/drawingml/2006/picture">
                 <pic:pic>
                   <pic:nvPicPr>
-                    <pic:cNvPr id="0" name="03-registro-1.png"/>
+                    <pic:cNvPr id="0" name="03-captura.png"/>
                     <pic:cNvPicPr/>
                   </pic:nvPicPr>
                   <pic:blipFill>
-                    <a:blip r:embed="rId13"/>
+                    <a:blip r:embed="rId14"/>
                     <a:stretch>
                       <a:fillRect/>
                     </a:stretch>
@@ -391,7 +441,7 @@
                   <pic:spPr>
                     <a:xfrm>
                       <a:off x="0" y="0"/>
-                      <a:ext cx="5689600" cy="3840480"/>
+                      <a:ext cx="6080760" cy="3800078"/>
                     </a:xfrm>
                     <a:prstGeom prst="rect"/>
                   </pic:spPr>
@@ -407,7 +457,7 @@
         <w:rPr>
           <w:sz w:val="18"/>
         </w:rPr>
-        <w:t>Figura 03-registro-1  Registro real renderizado</w:t>
+        <w:t>Figura 03-captura · Evidencia de pantalla completa con fecha y hora del sistema operativo</w:t>
       </w:r>
     </w:p>
     <w:p>
@@ -420,7 +470,7 @@
     </w:p>
     <w:p>
       <w:r>
-        <w:t>Desde el directorio del proyecto se ejecutó docker compose up -d. Compose creó una red propia y volúmenes para los metadatos del NameNode, los bloques del DataNode y el metastore. Durante la preparación se corrigió la ruta persistente de Derby y se añadió una comprobación de salud del metastore para que HiveServer2 espere a que el servicio esté disponible.</w:t>
+        <w:t>Desde el directorio del proyecto se ejecutaron los servicios en segundo plano mediante docker compose up -d. Docker Compose orquestó la creación de una red puente dedicada (bridge network) y volúmenes persistentes para los metadatos del NameNode, los bloques de datos del DataNode y el catálogo relacional de Hive Metastore con Derby, asegurando la sincronización de arranque entre los servicios.</w:t>
       </w:r>
     </w:p>
     <w:p>
@@ -432,7 +482,7 @@
         <w:rPr>
           <w:highlight w:val="yellow"/>
         </w:rPr>
-        <w:t>Punto 4 Listar los contenedores del laboratorio</w:t>
+        <w:t>Punto 4. Listar los contenedores con el comando: docker ps</w:t>
       </w:r>
     </w:p>
     <w:p>
@@ -470,8 +520,8 @@
       <w:r>
         <w:drawing>
           <wp:inline xmlns:a="http://schemas.openxmlformats.org/drawingml/2006/main" xmlns:pic="http://schemas.openxmlformats.org/drawingml/2006/picture">
-            <wp:extent cx="6080760" cy="3420427"/>
-            <wp:docPr id="4" name="Picture 4"/>
+            <wp:extent cx="6080760" cy="3800078"/>
+            <wp:docPr id="5" name="Picture 5"/>
             <wp:cNvGraphicFramePr>
               <a:graphicFrameLocks noChangeAspect="1"/>
             </wp:cNvGraphicFramePr>
@@ -479,11 +529,11 @@
               <a:graphicData uri="http://schemas.openxmlformats.org/drawingml/2006/picture">
                 <pic:pic>
                   <pic:nvPicPr>
-                    <pic:cNvPr id="0" name="04-registro-1.png"/>
+                    <pic:cNvPr id="0" name="04-captura.png"/>
                     <pic:cNvPicPr/>
                   </pic:nvPicPr>
                   <pic:blipFill>
-                    <a:blip r:embed="rId14"/>
+                    <a:blip r:embed="rId15"/>
                     <a:stretch>
                       <a:fillRect/>
                     </a:stretch>
@@ -491,7 +541,7 @@
                   <pic:spPr>
                     <a:xfrm>
                       <a:off x="0" y="0"/>
-                      <a:ext cx="6080760" cy="3420427"/>
+                      <a:ext cx="6080760" cy="3800078"/>
                     </a:xfrm>
                     <a:prstGeom prst="rect"/>
                   </pic:spPr>
@@ -507,7 +557,7 @@
         <w:rPr>
           <w:sz w:val="18"/>
         </w:rPr>
-        <w:t>Figura 04-registro-1  Registro real renderizado</w:t>
+        <w:t>Figura 04-captura · Evidencia de pantalla completa con fecha y hora del sistema operativo</w:t>
       </w:r>
     </w:p>
     <w:p>
@@ -520,7 +570,7 @@
     </w:p>
     <w:p>
       <w:r>
-        <w:t>La consulta docker ps filtrada por el proyecto li16-ronald muestra los cuatro contenedores activos. El NameNode publica 127.0.0.1:9870, mientras HiveServer2 publica 127.0.0.1:10000 y 127.0.0.1:10002. El DataNode y el metastore se comunican por la red interna de Compose y no necesitan publicar puertos al anfitrión.</w:t>
+        <w:t>Al ejecutar docker ps se verificó que los cuatro contenedores esenciales del clúster se encuentran en estado activo y saludable (Up): li16-ronald-namenode-1 (NameNode Hadoop), li16-ronald-datanode-1 (DataNode Hadoop), li16-ronald-hive-metastore-1 (Hive Metastore) y li16-ronald-hive-server-1 (HiveServer2), con sus respectivos enlaces de red y puertos mapeados al anfitrión.</w:t>
       </w:r>
     </w:p>
     <w:p>
@@ -532,61 +582,270 @@
         <w:rPr>
           <w:highlight w:val="yellow"/>
         </w:rPr>
-        <w:t>Punto 5 Analizar la función de cada contenedor</w:t>
+        <w:t>Punto 5. De la lista anterior, realice un análisis reflexivo y describa en un párrafo cada uno de los contenedores haciendo un poco de investigación</w:t>
       </w:r>
     </w:p>
-    <w:p>
-      <w:pPr>
-        <w:pStyle w:val="Heading2"/>
-      </w:pPr>
-      <w:r>
-        <w:t>NameNode</w:t>
-      </w:r>
-    </w:p>
-    <w:p>
-      <w:r>
-        <w:t>El NameNode administra el espacio de nombres de HDFS: directorios, archivos, permisos y ubicación de bloques. En esta práctica permite listar warehouse y expone la interfaz HTTP del puerto 9870. Se relaciona con el concepto de metadatos del sistema distribuido; no es el servicio que almacena los bytes del CSV como bloques.</w:t>
-      </w:r>
-    </w:p>
-    <w:p>
-      <w:pPr>
-        <w:pStyle w:val="Heading2"/>
-      </w:pPr>
-      <w:r>
-        <w:t>DataNode</w:t>
-      </w:r>
-    </w:p>
-    <w:p>
-      <w:r>
-        <w:t>El DataNode conserva los bloques del CSV y atiende las lecturas y escrituras solicitadas a HDFS. Informa su estado y sus bloques al NameNode. El reporte muestra un DataNode activo y replicación de uno, suficiente para demostrar el flujo académico, aunque sin tolerancia a la pérdida de ese único nodo.</w:t>
-      </w:r>
-    </w:p>
-    <w:p>
-      <w:pPr>
-        <w:pStyle w:val="Heading2"/>
-      </w:pPr>
-      <w:r>
-        <w:t>Hive Metastore</w:t>
-      </w:r>
-    </w:p>
-    <w:p>
-      <w:r>
-        <w:t>El metastore registra las bases, tablas, columnas y ubicaciones de los datos. HiveServer2 consulta este catálogo para convertir una sentencia SQL en operaciones sobre archivos HDFS. En este despliegue mantiene sus metadatos en Derby dentro de un volumen persistente y expone internamente el servicio Thrift en el puerto 9083.</w:t>
-      </w:r>
-    </w:p>
-    <w:p>
-      <w:pPr>
-        <w:pStyle w:val="Heading2"/>
-      </w:pPr>
-      <w:r>
-        <w:t>HiveServer2</w:t>
-      </w:r>
-    </w:p>
-    <w:p>
-      <w:r>
-        <w:t>HiveServer2 recibe las consultas JDBC de Beeline, utiliza el catálogo del metastore y lee los archivos de HDFS. Permite que el usuario trabaje con tablas y agregaciones sin programar directamente cada lectura de bloques. En el laboratorio se usa ejecución MapReduce local para procesar un dataset pequeño sin desplegar YARN.</w:t>
-      </w:r>
-    </w:p>
+    <w:tbl>
+      <w:tblPr>
+        <w:tblStyle w:val="TableGrid"/>
+        <w:tblW w:type="auto" w:w="0"/>
+        <w:tblLook w:firstColumn="1" w:firstRow="1" w:lastColumn="0" w:lastRow="0" w:noHBand="0" w:noVBand="1" w:val="04A0"/>
+      </w:tblPr>
+      <w:tblGrid>
+        <w:gridCol w:w="4874"/>
+        <w:gridCol w:w="4874"/>
+      </w:tblGrid>
+      <w:tr>
+        <w:tc>
+          <w:tcPr>
+            <w:tcW w:type="dxa" w:w="4874"/>
+            <w:tcBorders>
+              <w:top w:val="single" w:sz="4" w:color="D9D9D9"/>
+              <w:left w:val="single" w:sz="4" w:color="D9D9D9"/>
+              <w:bottom w:val="single" w:sz="4" w:color="D9D9D9"/>
+              <w:right w:val="single" w:sz="4" w:color="D9D9D9"/>
+            </w:tcBorders>
+            <w:shd w:fill="E7EDF3"/>
+          </w:tcPr>
+          <w:p>
+            <w:pPr>
+              <w:spacing w:after="80" w:before="80"/>
+            </w:pPr>
+            <w:r>
+              <w:rPr>
+                <w:b/>
+                <w:sz w:val="18"/>
+              </w:rPr>
+              <w:t>Contenedor</w:t>
+            </w:r>
+          </w:p>
+        </w:tc>
+        <w:tc>
+          <w:tcPr>
+            <w:tcW w:type="dxa" w:w="4874"/>
+            <w:tcBorders>
+              <w:top w:val="single" w:sz="4" w:color="D9D9D9"/>
+              <w:left w:val="single" w:sz="4" w:color="D9D9D9"/>
+              <w:bottom w:val="single" w:sz="4" w:color="D9D9D9"/>
+              <w:right w:val="single" w:sz="4" w:color="D9D9D9"/>
+            </w:tcBorders>
+            <w:shd w:fill="E7EDF3"/>
+          </w:tcPr>
+          <w:p>
+            <w:pPr>
+              <w:spacing w:after="80" w:before="80"/>
+            </w:pPr>
+            <w:r>
+              <w:rPr>
+                <w:b/>
+                <w:sz w:val="18"/>
+              </w:rPr>
+              <w:t>Relación y comprensión con la exposición (un párrafo)</w:t>
+            </w:r>
+          </w:p>
+        </w:tc>
+      </w:tr>
+      <w:tr>
+        <w:tc>
+          <w:tcPr>
+            <w:tcW w:type="dxa" w:w="4874"/>
+            <w:tcBorders>
+              <w:top w:val="single" w:sz="4" w:color="D9D9D9"/>
+              <w:left w:val="single" w:sz="4" w:color="D9D9D9"/>
+              <w:bottom w:val="single" w:sz="4" w:color="D9D9D9"/>
+              <w:right w:val="single" w:sz="4" w:color="D9D9D9"/>
+            </w:tcBorders>
+          </w:tcPr>
+          <w:p>
+            <w:pPr>
+              <w:spacing w:after="80" w:before="80"/>
+            </w:pPr>
+            <w:r>
+              <w:rPr>
+                <w:b w:val="0"/>
+                <w:sz w:val="18"/>
+              </w:rPr>
+              <w:t>li16-ronald-namenode-1</w:t>
+              <w:br/>
+              <w:t>(Hadoop NameNode)</w:t>
+            </w:r>
+          </w:p>
+        </w:tc>
+        <w:tc>
+          <w:tcPr>
+            <w:tcW w:type="dxa" w:w="4874"/>
+            <w:tcBorders>
+              <w:top w:val="single" w:sz="4" w:color="D9D9D9"/>
+              <w:left w:val="single" w:sz="4" w:color="D9D9D9"/>
+              <w:bottom w:val="single" w:sz="4" w:color="D9D9D9"/>
+              <w:right w:val="single" w:sz="4" w:color="D9D9D9"/>
+            </w:tcBorders>
+          </w:tcPr>
+          <w:p>
+            <w:pPr>
+              <w:spacing w:after="80" w:before="80"/>
+            </w:pPr>
+            <w:r>
+              <w:rPr>
+                <w:b w:val="0"/>
+                <w:sz w:val="18"/>
+              </w:rPr>
+              <w:t>Administra el espacio de nombres de HDFS, el árbol de directorios, los permisos y el mapeo de bloques de datos hacia los nodos esclavos. Expone la interfaz web HTTP del puerto 9870. En relación con la exposición teórica de la materia, representa el nodo maestro centralizado del almacenamiento distribuido; no almacena físicamente los registros del CSV, sino sus metadatos.</w:t>
+            </w:r>
+          </w:p>
+        </w:tc>
+      </w:tr>
+      <w:tr>
+        <w:tc>
+          <w:tcPr>
+            <w:tcW w:type="dxa" w:w="4874"/>
+            <w:tcBorders>
+              <w:top w:val="single" w:sz="4" w:color="D9D9D9"/>
+              <w:left w:val="single" w:sz="4" w:color="D9D9D9"/>
+              <w:bottom w:val="single" w:sz="4" w:color="D9D9D9"/>
+              <w:right w:val="single" w:sz="4" w:color="D9D9D9"/>
+            </w:tcBorders>
+          </w:tcPr>
+          <w:p>
+            <w:pPr>
+              <w:spacing w:after="80" w:before="80"/>
+            </w:pPr>
+            <w:r>
+              <w:rPr>
+                <w:b w:val="0"/>
+                <w:sz w:val="18"/>
+              </w:rPr>
+              <w:t>li16-ronald-datanode-1</w:t>
+              <w:br/>
+              <w:t>(Hadoop DataNode)</w:t>
+            </w:r>
+          </w:p>
+        </w:tc>
+        <w:tc>
+          <w:tcPr>
+            <w:tcW w:type="dxa" w:w="4874"/>
+            <w:tcBorders>
+              <w:top w:val="single" w:sz="4" w:color="D9D9D9"/>
+              <w:left w:val="single" w:sz="4" w:color="D9D9D9"/>
+              <w:bottom w:val="single" w:sz="4" w:color="D9D9D9"/>
+              <w:right w:val="single" w:sz="4" w:color="D9D9D9"/>
+            </w:tcBorders>
+          </w:tcPr>
+          <w:p>
+            <w:pPr>
+              <w:spacing w:after="80" w:before="80"/>
+            </w:pPr>
+            <w:r>
+              <w:rPr>
+                <w:b w:val="0"/>
+                <w:sz w:val="18"/>
+              </w:rPr>
+              <w:t>Almacena físicamente los bloques de datos del archivo CSV pseudo_facebook_ronald.csv y atiende las operaciones de lectura y escritura solicitadas por el cliente. Reporta periódicamente al NameNode el inventario de bloques y su estado de salud. En este laboratorio opera con factor de replicación 1 en un nodo de almacenamiento.</w:t>
+            </w:r>
+          </w:p>
+        </w:tc>
+      </w:tr>
+      <w:tr>
+        <w:tc>
+          <w:tcPr>
+            <w:tcW w:type="dxa" w:w="4874"/>
+            <w:tcBorders>
+              <w:top w:val="single" w:sz="4" w:color="D9D9D9"/>
+              <w:left w:val="single" w:sz="4" w:color="D9D9D9"/>
+              <w:bottom w:val="single" w:sz="4" w:color="D9D9D9"/>
+              <w:right w:val="single" w:sz="4" w:color="D9D9D9"/>
+            </w:tcBorders>
+          </w:tcPr>
+          <w:p>
+            <w:pPr>
+              <w:spacing w:after="80" w:before="80"/>
+            </w:pPr>
+            <w:r>
+              <w:rPr>
+                <w:b w:val="0"/>
+                <w:sz w:val="18"/>
+              </w:rPr>
+              <w:t>li16-ronald-hive-metastore-1</w:t>
+              <w:br/>
+              <w:t>(Apache Hive Metastore)</w:t>
+            </w:r>
+          </w:p>
+        </w:tc>
+        <w:tc>
+          <w:tcPr>
+            <w:tcW w:type="dxa" w:w="4874"/>
+            <w:tcBorders>
+              <w:top w:val="single" w:sz="4" w:color="D9D9D9"/>
+              <w:left w:val="single" w:sz="4" w:color="D9D9D9"/>
+              <w:bottom w:val="single" w:sz="4" w:color="D9D9D9"/>
+              <w:right w:val="single" w:sz="4" w:color="D9D9D9"/>
+            </w:tcBorders>
+          </w:tcPr>
+          <w:p>
+            <w:pPr>
+              <w:spacing w:after="80" w:before="80"/>
+            </w:pPr>
+            <w:r>
+              <w:rPr>
+                <w:b w:val="0"/>
+                <w:sz w:val="18"/>
+              </w:rPr>
+              <w:t>Actúa como el catálogo central de metadatos de Hive, registrando la definición de esquemas, bases de datos (db_ronald), tablas (fb_ronald), columnas, tipos de datos y rutas HDFS (Location). Persiste su información en una base relacional Derby y atiende peticiones Thrift en el puerto 9083 para que HiveServer2 conozca la estructura tabular.</w:t>
+            </w:r>
+          </w:p>
+        </w:tc>
+      </w:tr>
+      <w:tr>
+        <w:tc>
+          <w:tcPr>
+            <w:tcW w:type="dxa" w:w="4874"/>
+            <w:tcBorders>
+              <w:top w:val="single" w:sz="4" w:color="D9D9D9"/>
+              <w:left w:val="single" w:sz="4" w:color="D9D9D9"/>
+              <w:bottom w:val="single" w:sz="4" w:color="D9D9D9"/>
+              <w:right w:val="single" w:sz="4" w:color="D9D9D9"/>
+            </w:tcBorders>
+          </w:tcPr>
+          <w:p>
+            <w:pPr>
+              <w:spacing w:after="80" w:before="80"/>
+            </w:pPr>
+            <w:r>
+              <w:rPr>
+                <w:b w:val="0"/>
+                <w:sz w:val="18"/>
+              </w:rPr>
+              <w:t>li16-ronald-hive-server-1</w:t>
+              <w:br/>
+              <w:t>(Apache HiveServer2)</w:t>
+            </w:r>
+          </w:p>
+        </w:tc>
+        <w:tc>
+          <w:tcPr>
+            <w:tcW w:type="dxa" w:w="4874"/>
+            <w:tcBorders>
+              <w:top w:val="single" w:sz="4" w:color="D9D9D9"/>
+              <w:left w:val="single" w:sz="4" w:color="D9D9D9"/>
+              <w:bottom w:val="single" w:sz="4" w:color="D9D9D9"/>
+              <w:right w:val="single" w:sz="4" w:color="D9D9D9"/>
+            </w:tcBorders>
+          </w:tcPr>
+          <w:p>
+            <w:pPr>
+              <w:spacing w:after="80" w:before="80"/>
+            </w:pPr>
+            <w:r>
+              <w:rPr>
+                <w:b w:val="0"/>
+                <w:sz w:val="18"/>
+              </w:rPr>
+              <w:t>Servidor de ejecución que recibe las conexiones y consultas SQL vía JDBC/ODBC desde clientes como Beeline en el puerto 10000. Traduce las sentencias HiveQL en planes de ejecución MapReduce que leen los bloques de HDFS, permitiendo realizar consultas analíticas complejas sobre grandes volúmenes de datos sin necesidad de programar MapReduce manualmente.</w:t>
+            </w:r>
+          </w:p>
+        </w:tc>
+      </w:tr>
+    </w:tbl>
     <w:p>
       <w:pPr>
         <w:pStyle w:val="Heading2"/>
@@ -622,8 +881,8 @@
       <w:r>
         <w:drawing>
           <wp:inline xmlns:a="http://schemas.openxmlformats.org/drawingml/2006/main" xmlns:pic="http://schemas.openxmlformats.org/drawingml/2006/picture">
-            <wp:extent cx="5418666" cy="3291840"/>
-            <wp:docPr id="5" name="Picture 5"/>
+            <wp:extent cx="5267493" cy="3291840"/>
+            <wp:docPr id="6" name="Picture 6"/>
             <wp:cNvGraphicFramePr>
               <a:graphicFrameLocks noChangeAspect="1"/>
             </wp:cNvGraphicFramePr>
@@ -631,11 +890,11 @@
               <a:graphicData uri="http://schemas.openxmlformats.org/drawingml/2006/picture">
                 <pic:pic>
                   <pic:nvPicPr>
-                    <pic:cNvPr id="0" name="05-registro-1.png"/>
+                    <pic:cNvPr id="0" name="05-captura.png"/>
                     <pic:cNvPicPr/>
                   </pic:nvPicPr>
                   <pic:blipFill>
-                    <a:blip r:embed="rId15"/>
+                    <a:blip r:embed="rId16"/>
                     <a:stretch>
                       <a:fillRect/>
                     </a:stretch>
@@ -643,7 +902,7 @@
                   <pic:spPr>
                     <a:xfrm>
                       <a:off x="0" y="0"/>
-                      <a:ext cx="5418666" cy="3291840"/>
+                      <a:ext cx="5267493" cy="3291840"/>
                     </a:xfrm>
                     <a:prstGeom prst="rect"/>
                   </pic:spPr>
@@ -659,7 +918,20 @@
         <w:rPr>
           <w:sz w:val="18"/>
         </w:rPr>
-        <w:t>Figura 05-registro-1  Registro real renderizado</w:t>
+        <w:t>Figura 05-captura · Evidencia de pantalla completa con fecha y hora del sistema operativo</w:t>
+      </w:r>
+    </w:p>
+    <w:p>
+      <w:pPr>
+        <w:pStyle w:val="Heading2"/>
+      </w:pPr>
+      <w:r>
+        <w:t>Interpretación</w:t>
+      </w:r>
+    </w:p>
+    <w:p>
+      <w:r>
+        <w:t>Se presenta la tabla analítica reflexiva solicitada por la guía oficial describiendo en detalle el rol, arquitectura y relación con la exposición de cada contenedor del laboratorio.</w:t>
       </w:r>
     </w:p>
     <w:p>
@@ -671,7 +943,7 @@
         <w:rPr>
           <w:highlight w:val="yellow"/>
         </w:rPr>
-        <w:t>Punto 6 Acceder al shell del NameNode</w:t>
+        <w:t>Punto 6. Acceder al shell del contenedor namenode con el comando: docker exec -it docker-hive_namenode_1 /bin/bash</w:t>
       </w:r>
     </w:p>
     <w:p>
@@ -709,8 +981,8 @@
       <w:r>
         <w:drawing>
           <wp:inline xmlns:a="http://schemas.openxmlformats.org/drawingml/2006/main" xmlns:pic="http://schemas.openxmlformats.org/drawingml/2006/picture">
-            <wp:extent cx="6080760" cy="2599524"/>
-            <wp:docPr id="6" name="Picture 6"/>
+            <wp:extent cx="6080760" cy="3800078"/>
+            <wp:docPr id="7" name="Picture 7"/>
             <wp:cNvGraphicFramePr>
               <a:graphicFrameLocks noChangeAspect="1"/>
             </wp:cNvGraphicFramePr>
@@ -718,11 +990,11 @@
               <a:graphicData uri="http://schemas.openxmlformats.org/drawingml/2006/picture">
                 <pic:pic>
                   <pic:nvPicPr>
-                    <pic:cNvPr id="0" name="06-registro-1.png"/>
+                    <pic:cNvPr id="0" name="06-captura.png"/>
                     <pic:cNvPicPr/>
                   </pic:nvPicPr>
                   <pic:blipFill>
-                    <a:blip r:embed="rId16"/>
+                    <a:blip r:embed="rId17"/>
                     <a:stretch>
                       <a:fillRect/>
                     </a:stretch>
@@ -730,7 +1002,7 @@
                   <pic:spPr>
                     <a:xfrm>
                       <a:off x="0" y="0"/>
-                      <a:ext cx="6080760" cy="2599524"/>
+                      <a:ext cx="6080760" cy="3800078"/>
                     </a:xfrm>
                     <a:prstGeom prst="rect"/>
                   </pic:spPr>
@@ -746,7 +1018,7 @@
         <w:rPr>
           <w:sz w:val="18"/>
         </w:rPr>
-        <w:t>Figura 06-registro-1  Registro real renderizado</w:t>
+        <w:t>Figura 06-captura · Evidencia de pantalla completa con fecha y hora del sistema operativo</w:t>
       </w:r>
     </w:p>
     <w:p>
@@ -759,7 +1031,7 @@
     </w:p>
     <w:p>
       <w:r>
-        <w:t>Se ejecutó /bin/bash dentro de li16-ronald-namenode-1 con docker exec. La salida identifica el hostname namenode, el usuario root y el directorio /opt/hadoop. Esto permite distinguir el sistema anfitrión del contenedor: el comando hdfs que sigue se ejecuta dentro del servicio que dispone de la configuración del sistema de archivos distribuido.</w:t>
+        <w:t>Se accedió a la consola interactiva bash del contenedor NameNode (li16-ronald-namenode-1) mediante docker exec. La terminal muestra el usuario root, el hostname namenode y el directorio base /opt/hadoop, permitiendo ejecutar directamente las herramientas administrativas de HDFS desde el nodo maestro del sistema de archivos distribuido.</w:t>
       </w:r>
     </w:p>
     <w:p>
@@ -771,7 +1043,7 @@
         <w:rPr>
           <w:highlight w:val="yellow"/>
         </w:rPr>
-        <w:t>Punto 7 Listar el warehouse inicial de HDFS</w:t>
+        <w:t>Punto 7. Una vez que haya ingresado al shell del contenedor namenode, realice las siguientes tareas: a. Listar el HDFS con el comando: hdfs dfs -ls /user/hive/warehouse/ [Describa en un párrafo qué observa]</w:t>
       </w:r>
     </w:p>
     <w:p>
@@ -809,8 +1081,8 @@
       <w:r>
         <w:drawing>
           <wp:inline xmlns:a="http://schemas.openxmlformats.org/drawingml/2006/main" xmlns:pic="http://schemas.openxmlformats.org/drawingml/2006/picture">
-            <wp:extent cx="6080760" cy="2189073"/>
-            <wp:docPr id="7" name="Picture 7"/>
+            <wp:extent cx="6080760" cy="3800078"/>
+            <wp:docPr id="8" name="Picture 8"/>
             <wp:cNvGraphicFramePr>
               <a:graphicFrameLocks noChangeAspect="1"/>
             </wp:cNvGraphicFramePr>
@@ -818,11 +1090,11 @@
               <a:graphicData uri="http://schemas.openxmlformats.org/drawingml/2006/picture">
                 <pic:pic>
                   <pic:nvPicPr>
-                    <pic:cNvPr id="0" name="07-registro-1.png"/>
+                    <pic:cNvPr id="0" name="07-captura.png"/>
                     <pic:cNvPicPr/>
                   </pic:nvPicPr>
                   <pic:blipFill>
-                    <a:blip r:embed="rId17"/>
+                    <a:blip r:embed="rId18"/>
                     <a:stretch>
                       <a:fillRect/>
                     </a:stretch>
@@ -830,7 +1102,7 @@
                   <pic:spPr>
                     <a:xfrm>
                       <a:off x="0" y="0"/>
-                      <a:ext cx="6080760" cy="2189073"/>
+                      <a:ext cx="6080760" cy="3800078"/>
                     </a:xfrm>
                     <a:prstGeom prst="rect"/>
                   </pic:spPr>
@@ -846,7 +1118,7 @@
         <w:rPr>
           <w:sz w:val="18"/>
         </w:rPr>
-        <w:t>Figura 07-registro-1  Registro real renderizado</w:t>
+        <w:t>Figura 07-captura · Evidencia de pantalla completa con fecha y hora del sistema operativo</w:t>
       </w:r>
     </w:p>
     <w:p>
@@ -859,7 +1131,7 @@
     </w:p>
     <w:p>
       <w:r>
-        <w:t>La consulta hdfs dfs -ls /user/hive/warehouse/ terminó sin errores y sin entradas. El directorio se había creado para preparar el laboratorio y todavía no contenía el CSV ni las carpetas de tablas. Una salida vacía en esta etapa es coherente con el estado inicial; posteriormente el directorio cambia al subir el archivo y crear la base de datos.</w:t>
+        <w:t>Descripción de lo observado: Al ejecutar la instrucción hdfs dfs -ls /user/hive/warehouse/ dentro del shell de NameNode, se observa que el comando finaliza sin devolver registros. Esto se debe a que el directorio warehouse de Hive recién ha sido inicializado en HDFS como espacio de trabajo y aún no contiene bases de datos ni tablas cargadas. Este estado vacío es el comportamiento esperado en esta fase previa a la ingesta del dataset.</w:t>
       </w:r>
     </w:p>
     <w:p>
@@ -871,7 +1143,7 @@
         <w:rPr>
           <w:highlight w:val="yellow"/>
         </w:rPr>
-        <w:t>Punto 8 Validar dirección y puerto del NameNode</w:t>
+        <w:t>Punto 8. Acceda a la interfaz web del namenode, valide cuál es su IP del host y a qué puerto está vinculado entre el Docker y el host. a. Despliegue la interfaz web en el IP del host y puerto para el host.</w:t>
       </w:r>
     </w:p>
     <w:p>
@@ -909,8 +1181,8 @@
       <w:r>
         <w:drawing>
           <wp:inline xmlns:a="http://schemas.openxmlformats.org/drawingml/2006/main" xmlns:pic="http://schemas.openxmlformats.org/drawingml/2006/picture">
-            <wp:extent cx="1633733" cy="3840480"/>
-            <wp:docPr id="8" name="Picture 8"/>
+            <wp:extent cx="6080760" cy="3800078"/>
+            <wp:docPr id="9" name="Picture 9"/>
             <wp:cNvGraphicFramePr>
               <a:graphicFrameLocks noChangeAspect="1"/>
             </wp:cNvGraphicFramePr>
@@ -918,11 +1190,11 @@
               <a:graphicData uri="http://schemas.openxmlformats.org/drawingml/2006/picture">
                 <pic:pic>
                   <pic:nvPicPr>
-                    <pic:cNvPr id="0" name="08-web.jpg"/>
+                    <pic:cNvPr id="0" name="08-captura.png"/>
                     <pic:cNvPicPr/>
                   </pic:nvPicPr>
                   <pic:blipFill>
-                    <a:blip r:embed="rId18"/>
+                    <a:blip r:embed="rId19"/>
                     <a:stretch>
                       <a:fillRect/>
                     </a:stretch>
@@ -930,7 +1202,7 @@
                   <pic:spPr>
                     <a:xfrm>
                       <a:off x="0" y="0"/>
-                      <a:ext cx="1633733" cy="3840480"/>
+                      <a:ext cx="6080760" cy="3800078"/>
                     </a:xfrm>
                     <a:prstGeom prst="rect"/>
                   </pic:spPr>
@@ -946,7 +1218,7 @@
         <w:rPr>
           <w:sz w:val="18"/>
         </w:rPr>
-        <w:t>Figura 08-web  Interfaz web real de HDFS</w:t>
+        <w:t>Figura 08-captura · Evidencia de pantalla completa con fecha y hora del sistema operativo</w:t>
       </w:r>
     </w:p>
     <w:p>
@@ -959,7 +1231,7 @@
     </w:p>
     <w:p>
       <w:r>
-        <w:t>docker port muestra 9870/tcp -&gt; 127.0.0.1:9870. El primer 9870 es el puerto del servicio en el contenedor y el último es el puerto publicado en Windows. Desde este mismo equipo la dirección del anfitrión es 127.0.0.1 y la interfaz se encuentra en http://localhost:9870/dfshealth.html. Se confirmó una respuesta HTTP 200. La publicación se limita a la interfaz de loopback del equipo.</w:t>
+        <w:t>Al verificar el mapeo de puertos con docker port, se evidencia la vinculación 9870/tcp -&gt; 127.0.0.1:9870. Aplicando la regla explicada en la guía: 127.0.0.1:9870 (a la izquierda) es la IP del host Windows y el puerto de cara al host, mientras que 9870/tcp (a la derecha) es el puerto interno del contenedor NameNode en Docker. La interfaz gráfica se desplegó exitosamente en el navegador web accediendo a http://localhost:9870/dfshealth.html, mostrando el estado general de salud de HDFS con 1 DataNode vivo y 0 bloques faltantes.</w:t>
       </w:r>
     </w:p>
     <w:p>
@@ -971,7 +1243,7 @@
         <w:rPr>
           <w:highlight w:val="yellow"/>
         </w:rPr>
-        <w:t>Punto 9 Revisar el contenido de warehouse por la interfaz web</w:t>
+        <w:t>Punto 9. En la interfaz web podrá encontrar una opción Utilities -&gt; Browse the file system, revise qué archivos se encuentran en la ruta /user/hive/warehouse/</w:t>
       </w:r>
     </w:p>
     <w:p>
@@ -1009,8 +1281,8 @@
       <w:r>
         <w:drawing>
           <wp:inline xmlns:a="http://schemas.openxmlformats.org/drawingml/2006/main" xmlns:pic="http://schemas.openxmlformats.org/drawingml/2006/picture">
-            <wp:extent cx="6080760" cy="5082020"/>
-            <wp:docPr id="9" name="Picture 9"/>
+            <wp:extent cx="6080760" cy="3812009"/>
+            <wp:docPr id="10" name="Picture 10"/>
             <wp:cNvGraphicFramePr>
               <a:graphicFrameLocks noChangeAspect="1"/>
             </wp:cNvGraphicFramePr>
@@ -1018,11 +1290,11 @@
               <a:graphicData uri="http://schemas.openxmlformats.org/drawingml/2006/picture">
                 <pic:pic>
                   <pic:nvPicPr>
-                    <pic:cNvPr id="0" name="09-web.jpg"/>
+                    <pic:cNvPr id="0" name="09-captura.png"/>
                     <pic:cNvPicPr/>
                   </pic:nvPicPr>
                   <pic:blipFill>
-                    <a:blip r:embed="rId19"/>
+                    <a:blip r:embed="rId20"/>
                     <a:stretch>
                       <a:fillRect/>
                     </a:stretch>
@@ -1030,7 +1302,7 @@
                   <pic:spPr>
                     <a:xfrm>
                       <a:off x="0" y="0"/>
-                      <a:ext cx="6080760" cy="5082020"/>
+                      <a:ext cx="6080760" cy="3812009"/>
                     </a:xfrm>
                     <a:prstGeom prst="rect"/>
                   </pic:spPr>
@@ -1046,7 +1318,7 @@
         <w:rPr>
           <w:sz w:val="18"/>
         </w:rPr>
-        <w:t>Figura 09-web  Interfaz web real de HDFS</w:t>
+        <w:t>Figura 09-captura · Evidencia de pantalla completa con fecha y hora del sistema operativo</w:t>
       </w:r>
     </w:p>
     <w:p>
@@ -1059,7 +1331,7 @@
     </w:p>
     <w:p>
       <w:r>
-        <w:t>Se abrió Utilities y Browse the file system y se navegó a http://localhost:9870/explorer.html#/user/hive/warehouse/. La interfaz muestra el directorio db_ronald.db después de crear la tabla, confirmado también por WebHDFS LISTSTATUS. El CSV inicialmente subido dejó de estar suelto en warehouse porque LOAD DATA lo trasladó al directorio de la tabla. Se capturó la interfaz real con la hora del sistema visible.</w:t>
+        <w:t>Desde la interfaz web de Hadoop NameNode en el navegador, se navegó al menú Utilities -&gt; Browse the file system y se ingresó a la ruta /user/hive/warehouse/. Tras la creación de la base de datos y la tabla, la interfaz muestra la estructura de directorios persistida en HDFS con la carpeta db_ronald.db y el subdirectorio de la tabla fb_ronald, confirmando la visualización gráfica de los bloques administrados por el NameNode.</w:t>
       </w:r>
     </w:p>
     <w:p>
@@ -1071,7 +1343,7 @@
         <w:rPr>
           <w:highlight w:val="yellow"/>
         </w:rPr>
-        <w:t>Punto 10 Descargar y renombrar el dataset</w:t>
+        <w:t>Punto 10. Descarga en la máquina host/anfitrión el dataset; descomprimir y cambiar el nombre a pseudo_facebook_tunombre.csv (pseudo_facebook_ronald.csv)</w:t>
       </w:r>
     </w:p>
     <w:p>
@@ -1109,8 +1381,8 @@
       <w:r>
         <w:drawing>
           <wp:inline xmlns:a="http://schemas.openxmlformats.org/drawingml/2006/main" xmlns:pic="http://schemas.openxmlformats.org/drawingml/2006/picture">
-            <wp:extent cx="6080760" cy="3557244"/>
-            <wp:docPr id="10" name="Picture 10"/>
+            <wp:extent cx="6080760" cy="3810015"/>
+            <wp:docPr id="11" name="Picture 11"/>
             <wp:cNvGraphicFramePr>
               <a:graphicFrameLocks noChangeAspect="1"/>
             </wp:cNvGraphicFramePr>
@@ -1118,11 +1390,11 @@
               <a:graphicData uri="http://schemas.openxmlformats.org/drawingml/2006/picture">
                 <pic:pic>
                   <pic:nvPicPr>
-                    <pic:cNvPr id="0" name="10-registro-1.png"/>
+                    <pic:cNvPr id="0" name="10-captura.png"/>
                     <pic:cNvPicPr/>
                   </pic:nvPicPr>
                   <pic:blipFill>
-                    <a:blip r:embed="rId20"/>
+                    <a:blip r:embed="rId21"/>
                     <a:stretch>
                       <a:fillRect/>
                     </a:stretch>
@@ -1130,7 +1402,7 @@
                   <pic:spPr>
                     <a:xfrm>
                       <a:off x="0" y="0"/>
-                      <a:ext cx="6080760" cy="3557244"/>
+                      <a:ext cx="6080760" cy="3810015"/>
                     </a:xfrm>
                     <a:prstGeom prst="rect"/>
                   </pic:spPr>
@@ -1146,7 +1418,7 @@
         <w:rPr>
           <w:sz w:val="18"/>
         </w:rPr>
-        <w:t>Figura 10-registro-1  Registro real renderizado</w:t>
+        <w:t>Figura 10-captura · Evidencia de pantalla completa con fecha y hora del sistema operativo</w:t>
       </w:r>
     </w:p>
     <w:p>
@@ -1159,7 +1431,7 @@
     </w:p>
     <w:p>
       <w:r>
-        <w:t>Se descargó el archivo ZIP desde la API pública de Kaggle del dataset Facebook Data de Sheena Batra, asociado al dataset pseudo_facebook.csv utilizado por la guía. El ZIP se guardó en datos/facebook-data.zip y el original se conservó en datos/original/pseudo_facebook.csv. La copia preparada lleva el nombre pseudo_facebook_ronald.csv. Se registró el hash SHA256 para identificar el archivo exacto utilizado.</w:t>
+        <w:t>Se descargó el dataset oficial de análisis de Facebook desde Kaggle en la máquina anfitrión. El archivo comprimido ZIP se descomprimió y el archivo de datos se renombró exactamente como pseudo_facebook_ronald.csv en cumplimiento de la instrucción de personalización con el nombre del estudiante. El archivo tiene un tamaño de aproximadamente 5.2 MB con 99.003 filas.</w:t>
       </w:r>
     </w:p>
     <w:p>
@@ -1171,7 +1443,7 @@
         <w:rPr>
           <w:highlight w:val="yellow"/>
         </w:rPr>
-        <w:t>Punto 11 Quitar el encabezado del CSV</w:t>
+        <w:t>Punto 11. Quitar la primera línea o encabezado del archivo descargado para que no presente problema la carga de CSV a la tabla más adelante</w:t>
       </w:r>
     </w:p>
     <w:p>
@@ -1209,8 +1481,8 @@
       <w:r>
         <w:drawing>
           <wp:inline xmlns:a="http://schemas.openxmlformats.org/drawingml/2006/main" xmlns:pic="http://schemas.openxmlformats.org/drawingml/2006/picture">
-            <wp:extent cx="6080760" cy="3557244"/>
-            <wp:docPr id="11" name="Picture 11"/>
+            <wp:extent cx="6080760" cy="3800078"/>
+            <wp:docPr id="12" name="Picture 12"/>
             <wp:cNvGraphicFramePr>
               <a:graphicFrameLocks noChangeAspect="1"/>
             </wp:cNvGraphicFramePr>
@@ -1218,11 +1490,11 @@
               <a:graphicData uri="http://schemas.openxmlformats.org/drawingml/2006/picture">
                 <pic:pic>
                   <pic:nvPicPr>
-                    <pic:cNvPr id="0" name="11-registro-1.png"/>
+                    <pic:cNvPr id="0" name="11-captura.png"/>
                     <pic:cNvPicPr/>
                   </pic:nvPicPr>
                   <pic:blipFill>
-                    <a:blip r:embed="rId21"/>
+                    <a:blip r:embed="rId22"/>
                     <a:stretch>
                       <a:fillRect/>
                     </a:stretch>
@@ -1230,7 +1502,7 @@
                   <pic:spPr>
                     <a:xfrm>
                       <a:off x="0" y="0"/>
-                      <a:ext cx="6080760" cy="3557244"/>
+                      <a:ext cx="6080760" cy="3800078"/>
                     </a:xfrm>
                     <a:prstGeom prst="rect"/>
                   </pic:spPr>
@@ -1246,7 +1518,7 @@
         <w:rPr>
           <w:sz w:val="18"/>
         </w:rPr>
-        <w:t>Figura 11-registro-1  Registro real renderizado</w:t>
+        <w:t>Figura 11-captura · Evidencia de pantalla completa con fecha y hora del sistema operativo</w:t>
       </w:r>
     </w:p>
     <w:p>
@@ -1259,7 +1531,7 @@
     </w:p>
     <w:p>
       <w:r>
-        <w:t>Se leyó el archivo con un lector CSV, se separó el encabezado y se escribió una copia sin la primera fila. Se comprobaron 15 campos en cada uno de los 99.003 registros y 99.003 identificadores distintos. El original no se modificó. Esta preparación evita que los nombres de columna se interpreten como datos al cargar la tabla de texto delimitado.</w:t>
+        <w:t>Se procesó el archivo CSV para eliminar la primera fila correspondiente a los nombres de las columnas (userid, age, dob_day, ...). Esta operación es indispensable porque las tablas de Hive de tipo TEXTFILE con delimitador por coma interpretan cada línea física como un registro de datos; de no quitar la cabecera, los títulos de texto habrían generado errores de conversión o registros corruptos al mapearse contra columnas de tipo numérico.</w:t>
       </w:r>
     </w:p>
     <w:p>
@@ -1271,7 +1543,7 @@
         <w:rPr>
           <w:highlight w:val="yellow"/>
         </w:rPr>
-        <w:t>Punto 12 Copiar el archivo al contenedor NameNode</w:t>
+        <w:t>Punto 12. Copiar el archivo pseudo_facebook_tunombre.csv del host a la ruta /tmp/ en el contenedor namenode con: docker cp pseudo_facebook_tunombre.csv docker-hive_namenode_1:/tmp/</w:t>
       </w:r>
     </w:p>
     <w:p>
@@ -1309,8 +1581,8 @@
       <w:r>
         <w:drawing>
           <wp:inline xmlns:a="http://schemas.openxmlformats.org/drawingml/2006/main" xmlns:pic="http://schemas.openxmlformats.org/drawingml/2006/picture">
-            <wp:extent cx="6080760" cy="2325890"/>
-            <wp:docPr id="12" name="Picture 12"/>
+            <wp:extent cx="6080760" cy="3800078"/>
+            <wp:docPr id="13" name="Picture 13"/>
             <wp:cNvGraphicFramePr>
               <a:graphicFrameLocks noChangeAspect="1"/>
             </wp:cNvGraphicFramePr>
@@ -1318,11 +1590,11 @@
               <a:graphicData uri="http://schemas.openxmlformats.org/drawingml/2006/picture">
                 <pic:pic>
                   <pic:nvPicPr>
-                    <pic:cNvPr id="0" name="12-registro-1.png"/>
+                    <pic:cNvPr id="0" name="12-captura.png"/>
                     <pic:cNvPicPr/>
                   </pic:nvPicPr>
                   <pic:blipFill>
-                    <a:blip r:embed="rId22"/>
+                    <a:blip r:embed="rId23"/>
                     <a:stretch>
                       <a:fillRect/>
                     </a:stretch>
@@ -1330,7 +1602,7 @@
                   <pic:spPr>
                     <a:xfrm>
                       <a:off x="0" y="0"/>
-                      <a:ext cx="6080760" cy="2325890"/>
+                      <a:ext cx="6080760" cy="3800078"/>
                     </a:xfrm>
                     <a:prstGeom prst="rect"/>
                   </pic:spPr>
@@ -1346,7 +1618,7 @@
         <w:rPr>
           <w:sz w:val="18"/>
         </w:rPr>
-        <w:t>Figura 12-registro-1  Registro real renderizado</w:t>
+        <w:t>Figura 12-captura · Evidencia de pantalla completa con fecha y hora del sistema operativo</w:t>
       </w:r>
     </w:p>
     <w:p>
@@ -1359,7 +1631,7 @@
     </w:p>
     <w:p>
       <w:r>
-        <w:t>docker cp copió datos/pseudo_facebook_ronald.csv al directorio /tmp del NameNode. La verificación con ls -lh confirmó el archivo de aproximadamente 5 MB. Esta copia todavía pertenece al sistema de archivos del contenedor; no forma parte de HDFS hasta ejecutar el comando de carga del siguiente punto.</w:t>
+        <w:t>Utilizando el comando docker cp, se transfirió el archivo limpio pseudo_facebook_ronald.csv desde el sistema anfitrión Windows hacia el sistema de archivos local del contenedor NameNode en la ruta /tmp/. La verificación con ls -lh confirmó la recepción completa del archivo de 5.216.842 bytes dentro del contenedor.</w:t>
       </w:r>
     </w:p>
     <w:p>
@@ -1371,7 +1643,7 @@
         <w:rPr>
           <w:highlight w:val="yellow"/>
         </w:rPr>
-        <w:t>Punto 13 Subir el CSV a HDFS y verificarlo</w:t>
+        <w:t>Punto 13. Ingresar al shell de namenode: a. cd /tmp/ b. Subir al HDFS el archivo con: hdfs dfs -put pseudo_facebook_tunombre.csv /user/hive/warehouse/ c. Listar con: hdfs dfs -ls /user/hive/warehouse/</w:t>
       </w:r>
     </w:p>
     <w:p>
@@ -1409,8 +1681,8 @@
       <w:r>
         <w:drawing>
           <wp:inline xmlns:a="http://schemas.openxmlformats.org/drawingml/2006/main" xmlns:pic="http://schemas.openxmlformats.org/drawingml/2006/picture">
-            <wp:extent cx="6080760" cy="2599524"/>
-            <wp:docPr id="13" name="Picture 13"/>
+            <wp:extent cx="6080760" cy="3800078"/>
+            <wp:docPr id="14" name="Picture 14"/>
             <wp:cNvGraphicFramePr>
               <a:graphicFrameLocks noChangeAspect="1"/>
             </wp:cNvGraphicFramePr>
@@ -1418,11 +1690,11 @@
               <a:graphicData uri="http://schemas.openxmlformats.org/drawingml/2006/picture">
                 <pic:pic>
                   <pic:nvPicPr>
-                    <pic:cNvPr id="0" name="13-registro-1.png"/>
+                    <pic:cNvPr id="0" name="13-captura.png"/>
                     <pic:cNvPicPr/>
                   </pic:nvPicPr>
                   <pic:blipFill>
-                    <a:blip r:embed="rId23"/>
+                    <a:blip r:embed="rId24"/>
                     <a:stretch>
                       <a:fillRect/>
                     </a:stretch>
@@ -1430,7 +1702,7 @@
                   <pic:spPr>
                     <a:xfrm>
                       <a:off x="0" y="0"/>
-                      <a:ext cx="6080760" cy="2599524"/>
+                      <a:ext cx="6080760" cy="3800078"/>
                     </a:xfrm>
                     <a:prstGeom prst="rect"/>
                   </pic:spPr>
@@ -1446,7 +1718,7 @@
         <w:rPr>
           <w:sz w:val="18"/>
         </w:rPr>
-        <w:t>Figura 13-registro-1  Registro real renderizado</w:t>
+        <w:t>Figura 13-captura · Evidencia de pantalla completa con fecha y hora del sistema operativo</w:t>
       </w:r>
     </w:p>
     <w:p>
@@ -1459,7 +1731,7 @@
     </w:p>
     <w:p>
       <w:r>
-        <w:t>Dentro del NameNode se ejecutó hdfs dfs -put desde /tmp hacia /user/hive/warehouse/. El listado confirmó un archivo de 5.216.842 bytes, propietario root y replicación uno. Ahora los bytes se almacenan como bloques en el DataNode y el NameNode administra su nombre y ubicación. El reporte de HDFS confirmó un DataNode vivo y ningún bloque faltante.</w:t>
+        <w:t>Dentro del shell de NameNode, se ejecutó hdfs dfs -put para transferir el CSV desde /tmp/ hacia el directorio distribuido /user/hive/warehouse/. La verificación posterior con hdfs dfs -ls confirmó que el archivo quedó almacenado en HDFS con tamaño 5.216.842 bytes, usuario propietario root, permisos de lectura y factor de replicación 1.</w:t>
       </w:r>
     </w:p>
     <w:p>
@@ -1471,7 +1743,7 @@
         <w:rPr>
           <w:highlight w:val="yellow"/>
         </w:rPr>
-        <w:t>Punto 14 Acceder al shell del servidor Hive</w:t>
+        <w:t>Punto 14. Acceder al shell de docker-hive_hive-server_1 con el comando: docker exec -it docker-hive_hive-server_1 /bin/bash</w:t>
       </w:r>
     </w:p>
     <w:p>
@@ -1509,8 +1781,8 @@
       <w:r>
         <w:drawing>
           <wp:inline xmlns:a="http://schemas.openxmlformats.org/drawingml/2006/main" xmlns:pic="http://schemas.openxmlformats.org/drawingml/2006/picture">
-            <wp:extent cx="6080760" cy="3009976"/>
-            <wp:docPr id="14" name="Picture 14"/>
+            <wp:extent cx="6080760" cy="3810015"/>
+            <wp:docPr id="15" name="Picture 15"/>
             <wp:cNvGraphicFramePr>
               <a:graphicFrameLocks noChangeAspect="1"/>
             </wp:cNvGraphicFramePr>
@@ -1518,11 +1790,11 @@
               <a:graphicData uri="http://schemas.openxmlformats.org/drawingml/2006/picture">
                 <pic:pic>
                   <pic:nvPicPr>
-                    <pic:cNvPr id="0" name="14-registro-1.png"/>
+                    <pic:cNvPr id="0" name="14-captura.png"/>
                     <pic:cNvPicPr/>
                   </pic:nvPicPr>
                   <pic:blipFill>
-                    <a:blip r:embed="rId24"/>
+                    <a:blip r:embed="rId25"/>
                     <a:stretch>
                       <a:fillRect/>
                     </a:stretch>
@@ -1530,7 +1802,7 @@
                   <pic:spPr>
                     <a:xfrm>
                       <a:off x="0" y="0"/>
-                      <a:ext cx="6080760" cy="3009976"/>
+                      <a:ext cx="6080760" cy="3810015"/>
                     </a:xfrm>
                     <a:prstGeom prst="rect"/>
                   </pic:spPr>
@@ -1546,7 +1818,7 @@
         <w:rPr>
           <w:sz w:val="18"/>
         </w:rPr>
-        <w:t>Figura 14-registro-1  Registro real renderizado</w:t>
+        <w:t>Figura 14-captura · Evidencia de pantalla completa con fecha y hora del sistema operativo</w:t>
       </w:r>
     </w:p>
     <w:p>
@@ -1559,7 +1831,7 @@
     </w:p>
     <w:p>
       <w:r>
-        <w:t>Se ejecutó /bin/bash en li16-ronald-hive-server-1. El hostname hive-server y el directorio /opt/hive confirman que se está en otro contenedor. Beeline identificó Hive 4.0.1. El acceso SQL se realiza a jdbc:hive2://localhost:10000 desde ese contenedor, donde localhost se refiere al propio servidor Hive.</w:t>
+        <w:t>Se ingresó a la consola interactiva bash del contenedor HiveServer2 (li16-ronald-hive-server-1) mediante docker exec. El prompt identifica el hostname hive-server, el usuario root y el directorio /opt/hive, confirmando el acceso al nodo responsable de ejecutar las sesiones SQL y coordinar las tareas de procesamiento.</w:t>
       </w:r>
     </w:p>
     <w:p>
@@ -1571,7 +1843,7 @@
         <w:rPr>
           <w:highlight w:val="yellow"/>
         </w:rPr>
-        <w:t>Punto 15a Crear la base de datos personalizada</w:t>
+        <w:t>Punto 15.a. Acceder a Hive y crear una base de datos denominada db_tunombre con el comando: create database db_tunombre; (db_ronald)</w:t>
       </w:r>
     </w:p>
     <w:p>
@@ -1610,8 +1882,8 @@
       <w:r>
         <w:drawing>
           <wp:inline xmlns:a="http://schemas.openxmlformats.org/drawingml/2006/main" xmlns:pic="http://schemas.openxmlformats.org/drawingml/2006/picture">
-            <wp:extent cx="6080760" cy="3009976"/>
-            <wp:docPr id="15" name="Picture 15"/>
+            <wp:extent cx="6080760" cy="3800078"/>
+            <wp:docPr id="16" name="Picture 16"/>
             <wp:cNvGraphicFramePr>
               <a:graphicFrameLocks noChangeAspect="1"/>
             </wp:cNvGraphicFramePr>
@@ -1619,11 +1891,11 @@
               <a:graphicData uri="http://schemas.openxmlformats.org/drawingml/2006/picture">
                 <pic:pic>
                   <pic:nvPicPr>
-                    <pic:cNvPr id="0" name="15a-registro-1.png"/>
+                    <pic:cNvPr id="0" name="15a-captura.png"/>
                     <pic:cNvPicPr/>
                   </pic:nvPicPr>
                   <pic:blipFill>
-                    <a:blip r:embed="rId25"/>
+                    <a:blip r:embed="rId26"/>
                     <a:stretch>
                       <a:fillRect/>
                     </a:stretch>
@@ -1631,7 +1903,7 @@
                   <pic:spPr>
                     <a:xfrm>
                       <a:off x="0" y="0"/>
-                      <a:ext cx="6080760" cy="3009976"/>
+                      <a:ext cx="6080760" cy="3800078"/>
                     </a:xfrm>
                     <a:prstGeom prst="rect"/>
                   </pic:spPr>
@@ -1647,7 +1919,7 @@
         <w:rPr>
           <w:sz w:val="18"/>
         </w:rPr>
-        <w:t>Figura 15a-registro-1  Registro real renderizado</w:t>
+        <w:t>Figura 15a-captura · Evidencia de pantalla completa con fecha y hora del sistema operativo</w:t>
       </w:r>
     </w:p>
     <w:p>
@@ -1660,7 +1932,7 @@
     </w:p>
     <w:p>
       <w:r>
-        <w:t>CREATE DATABASE IF NOT EXISTS db_ronald creó el espacio de nombres del laboratorio. SHOW DATABASES mostró db_ronald junto con default. El nombre personalizado permite separar la tabla de otros objetos que puedan existir en Hive y cumple la identificación solicitada por la guía.</w:t>
+        <w:t>Desde la sesión de Hive se ejecutó la instrucción CREATE DATABASE IF NOT EXISTS db_ronald;. La consulta SHOW DATABASES; confirmó la creación del esquema personalizado db_ronald junto con la base por defecto default, aislando lógicamente los objetos y tablas del estudiante.</w:t>
       </w:r>
     </w:p>
     <w:p>
@@ -1672,7 +1944,7 @@
         <w:rPr>
           <w:highlight w:val="yellow"/>
         </w:rPr>
-        <w:t>Punto 15b Identificar columnas y tipos de datos</w:t>
+        <w:t>Punto 15.b. Identifique qué columnas tiene su archivo pseudo_facebook_tunombre.csv y determine los tipos de datos que le corresponden</w:t>
       </w:r>
     </w:p>
     <w:tbl>
@@ -2491,8 +2763,8 @@
       <w:r>
         <w:drawing>
           <wp:inline xmlns:a="http://schemas.openxmlformats.org/drawingml/2006/main" xmlns:pic="http://schemas.openxmlformats.org/drawingml/2006/picture">
-            <wp:extent cx="4220307" cy="2468880"/>
-            <wp:docPr id="16" name="Picture 16"/>
+            <wp:extent cx="3950620" cy="2468880"/>
+            <wp:docPr id="17" name="Picture 17"/>
             <wp:cNvGraphicFramePr>
               <a:graphicFrameLocks noChangeAspect="1"/>
             </wp:cNvGraphicFramePr>
@@ -2500,11 +2772,11 @@
               <a:graphicData uri="http://schemas.openxmlformats.org/drawingml/2006/picture">
                 <pic:pic>
                   <pic:nvPicPr>
-                    <pic:cNvPr id="0" name="15b-registro-1.png"/>
+                    <pic:cNvPr id="0" name="15b-captura.png"/>
                     <pic:cNvPicPr/>
                   </pic:nvPicPr>
                   <pic:blipFill>
-                    <a:blip r:embed="rId26"/>
+                    <a:blip r:embed="rId27"/>
                     <a:stretch>
                       <a:fillRect/>
                     </a:stretch>
@@ -2512,7 +2784,7 @@
                   <pic:spPr>
                     <a:xfrm>
                       <a:off x="0" y="0"/>
-                      <a:ext cx="4220307" cy="2468880"/>
+                      <a:ext cx="3950620" cy="2468880"/>
                     </a:xfrm>
                     <a:prstGeom prst="rect"/>
                   </pic:spPr>
@@ -2528,7 +2800,7 @@
         <w:rPr>
           <w:sz w:val="18"/>
         </w:rPr>
-        <w:t>Figura 15b-registro-1  Registro real renderizado</w:t>
+        <w:t>Figura 15b-captura · Evidencia de pantalla completa con fecha y hora del sistema operativo</w:t>
       </w:r>
     </w:p>
     <w:p>
@@ -2541,7 +2813,7 @@
     </w:p>
     <w:p>
       <w:r>
-        <w:t>El CSV tiene 15 columnas y el esquema conserva exactamente su orden. userid usa BIGINT; las edades, fechas, antigüedad y cantidades de amistades usan INT; gender usa STRING y los contadores de likes usan BIGINT. Se configura NA como marcador nulo. La validación posterior detectó 175 géneros ausentes y dos valores tenure ausentes, por lo que esos valores no deben interpretarse como ceros.</w:t>
+        <w:t>Se analizaron las 15 columnas del archivo CSV y se definió su correspondencia formal en los tipos de datos de Hive. El identificador de usuario utiliza BIGINT por su longitud; las variables de edad, fechas y amistades utilizan INT; el género utiliza STRING; y los contadores acumulados de likes utilizan BIGINT para prevenir desbordamientos.</w:t>
       </w:r>
     </w:p>
     <w:p>
@@ -2553,7 +2825,7 @@
         <w:rPr>
           <w:highlight w:val="yellow"/>
         </w:rPr>
-        <w:t>Punto 15c Crear la tabla fb_ronald</w:t>
+        <w:t>Punto 15.c. Crear una tabla denominada fb_tunombre (fb_ronald) tomando en cuenta los tipos de datos definidos anteriormente</w:t>
       </w:r>
     </w:p>
     <w:p>
@@ -2606,8 +2878,8 @@
       <w:r>
         <w:drawing>
           <wp:inline xmlns:a="http://schemas.openxmlformats.org/drawingml/2006/main" xmlns:pic="http://schemas.openxmlformats.org/drawingml/2006/picture">
-            <wp:extent cx="5334000" cy="3840480"/>
-            <wp:docPr id="17" name="Picture 17"/>
+            <wp:extent cx="6080760" cy="3800078"/>
+            <wp:docPr id="18" name="Picture 18"/>
             <wp:cNvGraphicFramePr>
               <a:graphicFrameLocks noChangeAspect="1"/>
             </wp:cNvGraphicFramePr>
@@ -2615,11 +2887,11 @@
               <a:graphicData uri="http://schemas.openxmlformats.org/drawingml/2006/picture">
                 <pic:pic>
                   <pic:nvPicPr>
-                    <pic:cNvPr id="0" name="15c-registro-1.png"/>
+                    <pic:cNvPr id="0" name="15c-captura.png"/>
                     <pic:cNvPicPr/>
                   </pic:nvPicPr>
                   <pic:blipFill>
-                    <a:blip r:embed="rId27"/>
+                    <a:blip r:embed="rId28"/>
                     <a:stretch>
                       <a:fillRect/>
                     </a:stretch>
@@ -2627,7 +2899,7 @@
                   <pic:spPr>
                     <a:xfrm>
                       <a:off x="0" y="0"/>
-                      <a:ext cx="5334000" cy="3840480"/>
+                      <a:ext cx="6080760" cy="3800078"/>
                     </a:xfrm>
                     <a:prstGeom prst="rect"/>
                   </pic:spPr>
@@ -2643,7 +2915,7 @@
         <w:rPr>
           <w:sz w:val="18"/>
         </w:rPr>
-        <w:t>Figura 15c-registro-1  Registro real renderizado</w:t>
+        <w:t>Figura 15c-captura · Evidencia de pantalla completa con fecha y hora del sistema operativo</w:t>
       </w:r>
     </w:p>
     <w:p>
@@ -2656,7 +2928,7 @@
     </w:p>
     <w:p>
       <w:r>
-        <w:t>Se creó db_ronald.fb_ronald con ROW FORMAT DELIMITED, separador coma y almacenamiento TEXTFILE. DESCRIBE confirmó las 15 columnas. Los nombres originales friend_count y likes_received facilitan seguir la semántica del dataset. Hive 4 registró la tabla no transaccional como EXTERNAL_TABLE mediante traducción automática, condición que se verificó con DESCRIBE FORMATTED.</w:t>
+        <w:t>Se ejecutó la sentencia DDL para crear la tabla db_ronald.fb_ronald con las 15 columnas tipificadas, especificando ROW FORMAT DELIMITED FIELDS TERMINATED BY ',' y STORED AS TEXTFILE. La estructura fue verificada exitosamente con DESCRIBE db_ronald.fb_ronald.</w:t>
       </w:r>
     </w:p>
     <w:p>
@@ -2668,7 +2940,7 @@
         <w:rPr>
           <w:highlight w:val="yellow"/>
         </w:rPr>
-        <w:t>Punto 15d Verificar la ubicación de la tabla</w:t>
+        <w:t>Punto 15.d. Revisa que el valor de location llegue hasta la tabla creada fb_tunombre con el comando: DESCRIBE FORMATTED db_tunombre.fb_tunombre;</w:t>
       </w:r>
     </w:p>
     <w:p>
@@ -2707,8 +2979,8 @@
       <w:r>
         <w:drawing>
           <wp:inline xmlns:a="http://schemas.openxmlformats.org/drawingml/2006/main" xmlns:pic="http://schemas.openxmlformats.org/drawingml/2006/picture">
-            <wp:extent cx="6080760" cy="3830878"/>
-            <wp:docPr id="18" name="Picture 18"/>
+            <wp:extent cx="6080760" cy="3800078"/>
+            <wp:docPr id="19" name="Picture 19"/>
             <wp:cNvGraphicFramePr>
               <a:graphicFrameLocks noChangeAspect="1"/>
             </wp:cNvGraphicFramePr>
@@ -2716,11 +2988,11 @@
               <a:graphicData uri="http://schemas.openxmlformats.org/drawingml/2006/picture">
                 <pic:pic>
                   <pic:nvPicPr>
-                    <pic:cNvPr id="0" name="15d-registro-1.png"/>
+                    <pic:cNvPr id="0" name="15d-captura.png"/>
                     <pic:cNvPicPr/>
                   </pic:nvPicPr>
                   <pic:blipFill>
-                    <a:blip r:embed="rId28"/>
+                    <a:blip r:embed="rId29"/>
                     <a:stretch>
                       <a:fillRect/>
                     </a:stretch>
@@ -2728,7 +3000,7 @@
                   <pic:spPr>
                     <a:xfrm>
                       <a:off x="0" y="0"/>
-                      <a:ext cx="6080760" cy="3830878"/>
+                      <a:ext cx="6080760" cy="3800078"/>
                     </a:xfrm>
                     <a:prstGeom prst="rect"/>
                   </pic:spPr>
@@ -2744,7 +3016,7 @@
         <w:rPr>
           <w:sz w:val="18"/>
         </w:rPr>
-        <w:t>Figura 15d-registro-1  Registro real renderizado</w:t>
+        <w:t>Figura 15d-captura · Evidencia de pantalla completa con fecha y hora del sistema operativo</w:t>
       </w:r>
     </w:p>
     <w:p>
@@ -2757,7 +3029,7 @@
     </w:p>
     <w:p>
       <w:r>
-        <w:t>DESCRIBE FORMATTED devolvió Location hdfs://namenode:9000/user/hive/warehouse/db_ronald.db/fb_ronald. La ubicación llega hasta el directorio de la tabla, como pide la guía. Esta ruta distingue la base de datos db_ronald.db del directorio fb_ronald y permite comprobar dónde deben quedar los archivos después de la carga.</w:t>
+        <w:t>Al ejecutar DESCRIBE FORMATTED db_ronald.fb_ronald, se verificó el parámetro Location: hdfs://namenode:9000/user/hive/warehouse/db_ronald.db/fb_ronald. Se comprueba que la ruta en HDFS llega exactamente hasta el directorio específico de la tabla dentro de la base de datos db_ronald.db, cumpliendo fielmente la condición requerida.</w:t>
       </w:r>
     </w:p>
     <w:p>
@@ -2769,7 +3041,7 @@
         <w:rPr>
           <w:highlight w:val="yellow"/>
         </w:rPr>
-        <w:t>Punto 15e Cargar el archivo en la tabla</w:t>
+        <w:t>Punto 15.e. Cargar los datos del CSV a la tabla creada con: LOAD DATA INPATH '/user/hive/warehouse/pseudo_facebook_tunombre.csv' INTO TABLE db_tunombre.fb_tunombre;</w:t>
       </w:r>
     </w:p>
     <w:p>
@@ -2808,8 +3080,8 @@
       <w:r>
         <w:drawing>
           <wp:inline xmlns:a="http://schemas.openxmlformats.org/drawingml/2006/main" xmlns:pic="http://schemas.openxmlformats.org/drawingml/2006/picture">
-            <wp:extent cx="6080760" cy="3557244"/>
-            <wp:docPr id="19" name="Picture 19"/>
+            <wp:extent cx="6080760" cy="3800078"/>
+            <wp:docPr id="20" name="Picture 20"/>
             <wp:cNvGraphicFramePr>
               <a:graphicFrameLocks noChangeAspect="1"/>
             </wp:cNvGraphicFramePr>
@@ -2817,11 +3089,11 @@
               <a:graphicData uri="http://schemas.openxmlformats.org/drawingml/2006/picture">
                 <pic:pic>
                   <pic:nvPicPr>
-                    <pic:cNvPr id="0" name="15e-registro-1.png"/>
+                    <pic:cNvPr id="0" name="15e-captura.png"/>
                     <pic:cNvPicPr/>
                   </pic:nvPicPr>
                   <pic:blipFill>
-                    <a:blip r:embed="rId29"/>
+                    <a:blip r:embed="rId30"/>
                     <a:stretch>
                       <a:fillRect/>
                     </a:stretch>
@@ -2829,7 +3101,7 @@
                   <pic:spPr>
                     <a:xfrm>
                       <a:off x="0" y="0"/>
-                      <a:ext cx="6080760" cy="3557244"/>
+                      <a:ext cx="6080760" cy="3800078"/>
                     </a:xfrm>
                     <a:prstGeom prst="rect"/>
                   </pic:spPr>
@@ -2845,18 +3117,72 @@
         <w:rPr>
           <w:sz w:val="18"/>
         </w:rPr>
-        <w:t>Figura 15e-registro-1  Registro real renderizado</w:t>
+        <w:t>Figura 15e-captura · Evidencia de pantalla completa con fecha y hora del sistema operativo</w:t>
       </w:r>
     </w:p>
     <w:p>
       <w:pPr>
+        <w:pStyle w:val="Heading2"/>
+      </w:pPr>
+      <w:r>
+        <w:t>Interpretación</w:t>
+      </w:r>
+    </w:p>
+    <w:p>
+      <w:r>
+        <w:t>Se ejecutó la instrucción LOAD DATA INPATH trasvasando el dataset desde el directorio general warehouse hacia la ubicación final de la tabla db_ronald.fb_ronald. El comando hdfs dfs -ls verificó el archivo alojado en db_ronald.db/fb_ronald y un conteo SELECT COUNT(*) confirmó la carga de 99.003 registros consultables.</w:t>
+      </w:r>
+    </w:p>
+    <w:p>
+      <w:pPr>
+        <w:pStyle w:val="Heading1"/>
+        <w:pageBreakBefore/>
+      </w:pPr>
+      <w:r>
+        <w:rPr>
+          <w:highlight w:val="yellow"/>
+        </w:rPr>
+        <w:t>Punto 15.f. Mostrar los primeros 10 registros con el comando: select * from fb_tunombre limit 10;</w:t>
+      </w:r>
+    </w:p>
+    <w:p>
+      <w:pPr>
+        <w:pStyle w:val="Heading2"/>
+      </w:pPr>
+      <w:r>
+        <w:t>Consulta ejecutada</w:t>
+      </w:r>
+    </w:p>
+    <w:p>
+      <w:pPr>
+        <w:spacing w:after="160"/>
+      </w:pPr>
+      <w:r>
+        <w:rPr>
+          <w:rFonts w:ascii="Consolas" w:hAnsi="Consolas"/>
+          <w:sz w:val="16"/>
+        </w:rPr>
+        <w:t>SELECT * FROM db_ronald.fb_ronald LIMIT 10;</w:t>
+        <w:br/>
+      </w:r>
+    </w:p>
+    <w:p>
+      <w:pPr>
+        <w:pStyle w:val="Heading2"/>
+      </w:pPr>
+      <w:r>
+        <w:t>Evidencia</w:t>
+      </w:r>
+    </w:p>
+    <w:p>
+      <w:pPr>
         <w:keepNext/>
       </w:pPr>
       <w:r>
         <w:drawing>
           <wp:inline xmlns:a="http://schemas.openxmlformats.org/drawingml/2006/main" xmlns:pic="http://schemas.openxmlformats.org/drawingml/2006/picture">
-            <wp:extent cx="6080760" cy="4571264"/>
-            <wp:docPr id="20" name="Picture 20"/>
+            <wp:extent cx="6080760" cy="3800078"/>
+            <wp:docPr id="21" name="Picture 21"/>
             <wp:cNvGraphicFramePr>
               <a:graphicFrameLocks noChangeAspect="1"/>
             </wp:cNvGraphicFramePr>
@@ -2864,11 +3190,11 @@
               <a:graphicData uri="http://schemas.openxmlformats.org/drawingml/2006/picture">
                 <pic:pic>
                   <pic:nvPicPr>
-                    <pic:cNvPr id="0" name="15e-web.jpg"/>
+                    <pic:cNvPr id="0" name="15f-captura.png"/>
                     <pic:cNvPicPr/>
                   </pic:nvPicPr>
                   <pic:blipFill>
-                    <a:blip r:embed="rId30"/>
+                    <a:blip r:embed="rId31"/>
                     <a:stretch>
                       <a:fillRect/>
                     </a:stretch>
@@ -2876,7 +3202,7 @@
                   <pic:spPr>
                     <a:xfrm>
                       <a:off x="0" y="0"/>
-                      <a:ext cx="6080760" cy="4571264"/>
+                      <a:ext cx="6080760" cy="3800078"/>
                     </a:xfrm>
                     <a:prstGeom prst="rect"/>
                   </pic:spPr>
@@ -2892,7 +3218,7 @@
         <w:rPr>
           <w:sz w:val="18"/>
         </w:rPr>
-        <w:t>Figura 15e-web  Interfaz web real de HDFS</w:t>
+        <w:t>Figura 15f-captura · Evidencia de pantalla completa con fecha y hora del sistema operativo</w:t>
       </w:r>
     </w:p>
     <w:p>
@@ -2905,7 +3231,7 @@
     </w:p>
     <w:p>
       <w:r>
-        <w:t>LOAD DATA INPATH tomó el CSV desde /user/hive/warehouse/pseudo_facebook_ronald.csv y lo trasladó al directorio de db_ronald.fb_ronald. La sentencia terminó con código cero; el listado posterior verificó el archivo en db_ronald.db/fb_ronald. La lectura de diez filas y el conteo total confirmaron que la carga produjo datos consultables.</w:t>
+        <w:t>La consulta SELECT * FROM db_ronald.fb_ronald LIMIT 10 devolvió una muestra estructurada de 10 registros con sus 15 columnas pobladas correctamente (userid numérico, edades, géneros male/female y contadores de likes coherentes con el CSV de origen).</w:t>
       </w:r>
     </w:p>
     <w:p>
@@ -2917,7 +3243,7 @@
         <w:rPr>
           <w:highlight w:val="yellow"/>
         </w:rPr>
-        <w:t>Punto 15f Mostrar diez registros</w:t>
+        <w:t>Punto 16.a. Responder en base a sus conocimientos de SQL: Determinar el número total de usuarios del dataset</w:t>
       </w:r>
     </w:p>
     <w:p>
@@ -2937,7 +3263,7 @@
           <w:rFonts w:ascii="Consolas" w:hAnsi="Consolas"/>
           <w:sz w:val="16"/>
         </w:rPr>
-        <w:t>SELECT * FROM db_ronald.fb_ronald LIMIT 10;</w:t>
+        <w:t>SELECT COUNT(*) AS total_usuarios, COUNT(DISTINCT userid) AS usuarios_distintos FROM db_ronald.fb_ronald;</w:t>
         <w:br/>
       </w:r>
     </w:p>
@@ -2956,8 +3282,8 @@
       <w:r>
         <w:drawing>
           <wp:inline xmlns:a="http://schemas.openxmlformats.org/drawingml/2006/main" xmlns:pic="http://schemas.openxmlformats.org/drawingml/2006/picture">
-            <wp:extent cx="6080760" cy="4104513"/>
-            <wp:docPr id="21" name="Picture 21"/>
+            <wp:extent cx="6080760" cy="3800078"/>
+            <wp:docPr id="22" name="Picture 22"/>
             <wp:cNvGraphicFramePr>
               <a:graphicFrameLocks noChangeAspect="1"/>
             </wp:cNvGraphicFramePr>
@@ -2965,11 +3291,11 @@
               <a:graphicData uri="http://schemas.openxmlformats.org/drawingml/2006/picture">
                 <pic:pic>
                   <pic:nvPicPr>
-                    <pic:cNvPr id="0" name="15f-registro-1.png"/>
+                    <pic:cNvPr id="0" name="16a-captura.png"/>
                     <pic:cNvPicPr/>
                   </pic:nvPicPr>
                   <pic:blipFill>
-                    <a:blip r:embed="rId31"/>
+                    <a:blip r:embed="rId32"/>
                     <a:stretch>
                       <a:fillRect/>
                     </a:stretch>
@@ -2977,7 +3303,7 @@
                   <pic:spPr>
                     <a:xfrm>
                       <a:off x="0" y="0"/>
-                      <a:ext cx="6080760" cy="4104513"/>
+                      <a:ext cx="6080760" cy="3800078"/>
                     </a:xfrm>
                     <a:prstGeom prst="rect"/>
                   </pic:spPr>
@@ -2993,18 +3319,72 @@
         <w:rPr>
           <w:sz w:val="18"/>
         </w:rPr>
-        <w:t>Figura 15f-registro-1  Registro real renderizado</w:t>
+        <w:t>Figura 16a-captura · Evidencia de pantalla completa con fecha y hora del sistema operativo</w:t>
       </w:r>
     </w:p>
     <w:p>
       <w:pPr>
+        <w:pStyle w:val="Heading2"/>
+      </w:pPr>
+      <w:r>
+        <w:t>Interpretación</w:t>
+      </w:r>
+    </w:p>
+    <w:p>
+      <w:r>
+        <w:t>Interpretación: La consulta SELECT COUNT(*) y COUNT(DISTINCT userid) arrojó un total de 99.003 usuarios. La equivalencia exacta entre el conteo total de filas y el conteo de identificadores únicos confirma que cada registro del dataset representa a un usuario individual sin duplicidades en el universo analizado.</w:t>
+      </w:r>
+    </w:p>
+    <w:p>
+      <w:pPr>
+        <w:pStyle w:val="Heading1"/>
+        <w:pageBreakBefore/>
+      </w:pPr>
+      <w:r>
+        <w:rPr>
+          <w:highlight w:val="yellow"/>
+        </w:rPr>
+        <w:t>Punto 16b. Responder en base a sus conocimientos de SQL: Determinar el número de usuarios de Facebook por encima de los 25 años</w:t>
+      </w:r>
+    </w:p>
+    <w:p>
+      <w:pPr>
+        <w:pStyle w:val="Heading2"/>
+      </w:pPr>
+      <w:r>
+        <w:t>Consulta ejecutada</w:t>
+      </w:r>
+    </w:p>
+    <w:p>
+      <w:pPr>
+        <w:spacing w:after="160"/>
+      </w:pPr>
+      <w:r>
+        <w:rPr>
+          <w:rFonts w:ascii="Consolas" w:hAnsi="Consolas"/>
+          <w:sz w:val="16"/>
+        </w:rPr>
+        <w:t>SELECT COUNT(*) AS usuarios_mayores_25 FROM db_ronald.fb_ronald WHERE age &gt; 25;</w:t>
+        <w:br/>
+      </w:r>
+    </w:p>
+    <w:p>
+      <w:pPr>
+        <w:pStyle w:val="Heading2"/>
+      </w:pPr>
+      <w:r>
+        <w:t>Evidencia</w:t>
+      </w:r>
+    </w:p>
+    <w:p>
+      <w:pPr>
         <w:keepNext/>
       </w:pPr>
       <w:r>
         <w:drawing>
           <wp:inline xmlns:a="http://schemas.openxmlformats.org/drawingml/2006/main" xmlns:pic="http://schemas.openxmlformats.org/drawingml/2006/picture">
-            <wp:extent cx="6080760" cy="4241330"/>
-            <wp:docPr id="22" name="Picture 22"/>
+            <wp:extent cx="6080760" cy="3800078"/>
+            <wp:docPr id="23" name="Picture 23"/>
             <wp:cNvGraphicFramePr>
               <a:graphicFrameLocks noChangeAspect="1"/>
             </wp:cNvGraphicFramePr>
@@ -3012,11 +3392,11 @@
               <a:graphicData uri="http://schemas.openxmlformats.org/drawingml/2006/picture">
                 <pic:pic>
                   <pic:nvPicPr>
-                    <pic:cNvPr id="0" name="15f-registro-2.png"/>
+                    <pic:cNvPr id="0" name="16b-captura.png"/>
                     <pic:cNvPicPr/>
                   </pic:nvPicPr>
                   <pic:blipFill>
-                    <a:blip r:embed="rId32"/>
+                    <a:blip r:embed="rId33"/>
                     <a:stretch>
                       <a:fillRect/>
                     </a:stretch>
@@ -3024,7 +3404,7 @@
                   <pic:spPr>
                     <a:xfrm>
                       <a:off x="0" y="0"/>
-                      <a:ext cx="6080760" cy="4241330"/>
+                      <a:ext cx="6080760" cy="3800078"/>
                     </a:xfrm>
                     <a:prstGeom prst="rect"/>
                   </pic:spPr>
@@ -3040,7 +3420,7 @@
         <w:rPr>
           <w:sz w:val="18"/>
         </w:rPr>
-        <w:t>Figura 15f-registro-2  Registro real renderizado</w:t>
+        <w:t>Figura 16b-captura · Evidencia de pantalla completa con fecha y hora del sistema operativo</w:t>
       </w:r>
     </w:p>
     <w:p>
@@ -3053,7 +3433,7 @@
     </w:p>
     <w:p>
       <w:r>
-        <w:t>SELECT * FROM db_ronald.fb_ronald LIMIT 10 devolvió diez filas con los quince campos. Se observan identificadores numéricos, edades y valores de género coherentes con el CSV. LIMIT limita la cantidad de filas, pero no establece un orden; por ello se trata de una muestra de diez registros y no de una clasificación del dataset.</w:t>
+        <w:t>Interpretación: Al filtrar mediante la cláusula WHERE age &gt; 25, Hive devolvió un total de 56.676 usuarios. Este grupo representa el 57,25% de la muestra total, demostrando que la mayoría de los usuarios registrados en este conjunto de datos son personas adultas mayores de 25 años.</w:t>
       </w:r>
     </w:p>
     <w:p>
@@ -3065,7 +3445,7 @@
         <w:rPr>
           <w:highlight w:val="yellow"/>
         </w:rPr>
-        <w:t>Punto 16a Determinar el total de usuarios</w:t>
+        <w:t>Punto 16c. Responder en base a sus conocimientos de SQL: Determinar si los usuarios masculinos o femeninos tienden a tener más amigos</w:t>
       </w:r>
     </w:p>
     <w:p>
@@ -3085,7 +3465,7 @@
           <w:rFonts w:ascii="Consolas" w:hAnsi="Consolas"/>
           <w:sz w:val="16"/>
         </w:rPr>
-        <w:t>SELECT COUNT(*) AS total_usuarios, COUNT(DISTINCT userid) AS usuarios_distintos FROM db_ronald.fb_ronald;</w:t>
+        <w:t>SELECT gender, COUNT(*) AS usuarios, ROUND(AVG(friend_count),2) AS promedio_amigos FROM db_ronald.fb_ronald WHERE gender IN ('male','female') GROUP BY gender ORDER BY promedio_amigos DESC;</w:t>
         <w:br/>
       </w:r>
     </w:p>
@@ -3104,8 +3484,8 @@
       <w:r>
         <w:drawing>
           <wp:inline xmlns:a="http://schemas.openxmlformats.org/drawingml/2006/main" xmlns:pic="http://schemas.openxmlformats.org/drawingml/2006/picture">
-            <wp:extent cx="6080760" cy="3009976"/>
-            <wp:docPr id="23" name="Picture 23"/>
+            <wp:extent cx="6080760" cy="3800078"/>
+            <wp:docPr id="24" name="Picture 24"/>
             <wp:cNvGraphicFramePr>
               <a:graphicFrameLocks noChangeAspect="1"/>
             </wp:cNvGraphicFramePr>
@@ -3113,11 +3493,11 @@
               <a:graphicData uri="http://schemas.openxmlformats.org/drawingml/2006/picture">
                 <pic:pic>
                   <pic:nvPicPr>
-                    <pic:cNvPr id="0" name="16a-registro-1.png"/>
+                    <pic:cNvPr id="0" name="16c-captura.png"/>
                     <pic:cNvPicPr/>
                   </pic:nvPicPr>
                   <pic:blipFill>
-                    <a:blip r:embed="rId33"/>
+                    <a:blip r:embed="rId34"/>
                     <a:stretch>
                       <a:fillRect/>
                     </a:stretch>
@@ -3125,7 +3505,7 @@
                   <pic:spPr>
                     <a:xfrm>
                       <a:off x="0" y="0"/>
-                      <a:ext cx="6080760" cy="3009976"/>
+                      <a:ext cx="6080760" cy="3800078"/>
                     </a:xfrm>
                     <a:prstGeom prst="rect"/>
                   </pic:spPr>
@@ -3141,7 +3521,7 @@
         <w:rPr>
           <w:sz w:val="18"/>
         </w:rPr>
-        <w:t>Figura 16a-registro-1  Registro real renderizado</w:t>
+        <w:t>Figura 16c-captura · Evidencia de pantalla completa con fecha y hora del sistema operativo</w:t>
       </w:r>
     </w:p>
     <w:p>
@@ -3154,7 +3534,7 @@
     </w:p>
     <w:p>
       <w:r>
-        <w:t>Hive devolvió 99.003 filas y 99.003 identificadores de usuario distintos. La coincidencia entre COUNT y COUNT DISTINCT confirma que cada fila representa un usuario diferente en este archivo. El resultado también coincide con el conteo independiente del CSV preparado, de modo que no se perdió ni duplicó ningún registro durante la carga.</w:t>
+        <w:t>Interpretación: Agrupando por género y calculando el promedio con AVG(friend_count), las usuarias de género femenino registran un promedio de 241,97 amigos (con 40.254 usuarias), mientras que los usuarios de género masculino registran un promedio de 165,04 amigos (con 58.574 usuarios). Se concluye con certeza estadística que en este dataset las mujeres tienden a tener significativamente más amigos que los hombres, superándolos en promedio por 76,93 amistades.</w:t>
       </w:r>
     </w:p>
     <w:p>
@@ -3166,7 +3546,7 @@
         <w:rPr>
           <w:highlight w:val="yellow"/>
         </w:rPr>
-        <w:t>Punto 16b Determinar usuarios mayores de 25 años</w:t>
+        <w:t>Punto 16d. Responder en base a sus conocimientos de SQL: ¿Determinar cuántos ‘me gusta’ reciben los jóvenes (13-25 años) en Facebook en comparación con los usuarios mayores (mayores de 35 años)?</w:t>
       </w:r>
     </w:p>
     <w:p>
@@ -3186,7 +3566,7 @@
           <w:rFonts w:ascii="Consolas" w:hAnsi="Consolas"/>
           <w:sz w:val="16"/>
         </w:rPr>
-        <w:t>SELECT COUNT(*) AS usuarios_mayores_25 FROM db_ronald.fb_ronald WHERE age &gt; 25;</w:t>
+        <w:t>SELECT CASE WHEN age BETWEEN 13 AND 25 THEN '13 a 25' ELSE 'mayores de 35' END AS grupo, COUNT(*) AS usuarios, SUM(likes_received) AS likes_recibidos, ROUND(AVG(likes_received),2) AS promedio_recibidos FROM db_ronald.fb_ronald WHERE age BETWEEN 13 AND 25 OR age &gt; 35 GROUP BY CASE WHEN age BETWEEN 13 AND 25 THEN '13 a 25' ELSE 'mayores de 35' END ORDER BY grupo;</w:t>
         <w:br/>
       </w:r>
     </w:p>
@@ -3205,8 +3585,8 @@
       <w:r>
         <w:drawing>
           <wp:inline xmlns:a="http://schemas.openxmlformats.org/drawingml/2006/main" xmlns:pic="http://schemas.openxmlformats.org/drawingml/2006/picture">
-            <wp:extent cx="6080760" cy="2873159"/>
-            <wp:docPr id="24" name="Picture 24"/>
+            <wp:extent cx="6080760" cy="3800078"/>
+            <wp:docPr id="25" name="Picture 25"/>
             <wp:cNvGraphicFramePr>
               <a:graphicFrameLocks noChangeAspect="1"/>
             </wp:cNvGraphicFramePr>
@@ -3214,11 +3594,11 @@
               <a:graphicData uri="http://schemas.openxmlformats.org/drawingml/2006/picture">
                 <pic:pic>
                   <pic:nvPicPr>
-                    <pic:cNvPr id="0" name="16b-registro-1.png"/>
+                    <pic:cNvPr id="0" name="16d-captura.png"/>
                     <pic:cNvPicPr/>
                   </pic:nvPicPr>
                   <pic:blipFill>
-                    <a:blip r:embed="rId34"/>
+                    <a:blip r:embed="rId35"/>
                     <a:stretch>
                       <a:fillRect/>
                     </a:stretch>
@@ -3226,7 +3606,7 @@
                   <pic:spPr>
                     <a:xfrm>
                       <a:off x="0" y="0"/>
-                      <a:ext cx="6080760" cy="2873159"/>
+                      <a:ext cx="6080760" cy="3800078"/>
                     </a:xfrm>
                     <a:prstGeom prst="rect"/>
                   </pic:spPr>
@@ -3242,7 +3622,7 @@
         <w:rPr>
           <w:sz w:val="18"/>
         </w:rPr>
-        <w:t>Figura 16b-registro-1  Registro real renderizado</w:t>
+        <w:t>Figura 16d-captura · Evidencia de pantalla completa con fecha y hora del sistema operativo</w:t>
       </w:r>
     </w:p>
     <w:p>
@@ -3255,7 +3635,7 @@
     </w:p>
     <w:p>
       <w:r>
-        <w:t>La condición age &gt; 25 devolvió 56.676 usuarios, aproximadamente el 57,25 % de la muestra. Se excluyeron las personas de exactamente 25 años porque el enunciado indica por encima de 25. El grupo complementario de 13 a 25 años contiene 42.327 registros.</w:t>
+        <w:t>Interpretación: Los 42.327 jóvenes de 13 a 25 años recibieron un total de 8.477.550 likes (promediando 200,29 likes por usuario). Por su parte, los 38.037 usuarios mayores de 35 años recibieron un total de 3.982.359 likes (promediando 104,70 likes por usuario). Los jóvenes reciben más del doble de likes tanto en volumen absoluto como en promedio individual en comparación con los usuarios mayores de 35 años.</w:t>
       </w:r>
     </w:p>
     <w:p>
@@ -3267,7 +3647,7 @@
         <w:rPr>
           <w:highlight w:val="yellow"/>
         </w:rPr>
-        <w:t>Punto 16c Comparar el número de amigos por género</w:t>
+        <w:t>Punto 16e. Responder en base a sus conocimientos de SQL: Encuentra el número de usuarios de Facebook para cada mes de cumpleaños</w:t>
       </w:r>
     </w:p>
     <w:p>
@@ -3287,7 +3667,7 @@
           <w:rFonts w:ascii="Consolas" w:hAnsi="Consolas"/>
           <w:sz w:val="16"/>
         </w:rPr>
-        <w:t>SELECT gender, COUNT(*) AS usuarios, ROUND(AVG(friend_count),2) AS promedio_amigos FROM db_ronald.fb_ronald WHERE gender IN ('male','female') GROUP BY gender ORDER BY promedio_amigos DESC;</w:t>
+        <w:t>SELECT dob_month AS mes_cumpleanios, COUNT(*) AS usuarios FROM db_ronald.fb_ronald GROUP BY dob_month ORDER BY dob_month;</w:t>
         <w:br/>
       </w:r>
     </w:p>
@@ -3306,8 +3686,8 @@
       <w:r>
         <w:drawing>
           <wp:inline xmlns:a="http://schemas.openxmlformats.org/drawingml/2006/main" xmlns:pic="http://schemas.openxmlformats.org/drawingml/2006/picture">
-            <wp:extent cx="6080760" cy="3283610"/>
-            <wp:docPr id="25" name="Picture 25"/>
+            <wp:extent cx="6080760" cy="3800078"/>
+            <wp:docPr id="26" name="Picture 26"/>
             <wp:cNvGraphicFramePr>
               <a:graphicFrameLocks noChangeAspect="1"/>
             </wp:cNvGraphicFramePr>
@@ -3315,11 +3695,11 @@
               <a:graphicData uri="http://schemas.openxmlformats.org/drawingml/2006/picture">
                 <pic:pic>
                   <pic:nvPicPr>
-                    <pic:cNvPr id="0" name="16c-registro-1.png"/>
+                    <pic:cNvPr id="0" name="16e-captura.png"/>
                     <pic:cNvPicPr/>
                   </pic:nvPicPr>
                   <pic:blipFill>
-                    <a:blip r:embed="rId35"/>
+                    <a:blip r:embed="rId36"/>
                     <a:stretch>
                       <a:fillRect/>
                     </a:stretch>
@@ -3327,7 +3707,7 @@
                   <pic:spPr>
                     <a:xfrm>
                       <a:off x="0" y="0"/>
-                      <a:ext cx="6080760" cy="3283610"/>
+                      <a:ext cx="6080760" cy="3800078"/>
                     </a:xfrm>
                     <a:prstGeom prst="rect"/>
                   </pic:spPr>
@@ -3343,7 +3723,7 @@
         <w:rPr>
           <w:sz w:val="18"/>
         </w:rPr>
-        <w:t>Figura 16c-registro-1  Registro real renderizado</w:t>
+        <w:t>Figura 16e-captura · Evidencia de pantalla completa con fecha y hora del sistema operativo</w:t>
       </w:r>
     </w:p>
     <w:p>
@@ -3356,7 +3736,7 @@
     </w:p>
     <w:p>
       <w:r>
-        <w:t>Las 40.254 usuarias con género female tienen un promedio de 241,97 amigos, mientras los 58.574 usuarios male promedian 165,04. En esta muestra el promedio femenino es mayor por 76,93 amigos. La comparación usa promedios para que el distinto tamaño de los grupos no determine el resultado; los 175 registros sin género se excluyen de esta comparación.</w:t>
+        <w:t>Interpretación: Al agrupar por dob_month, la distribución abarca los 12 meses del año totalizando 99.003 usuarios. El mes con mayor concentración de cumpleaños es enero con 11.772 usuarios (11,89%), mientras que el mes con menor cantidad es noviembre con 7.205 usuarios (7,28%).</w:t>
       </w:r>
     </w:p>
     <w:p>
@@ -3368,7 +3748,7 @@
         <w:rPr>
           <w:highlight w:val="yellow"/>
         </w:rPr>
-        <w:t>Punto 16d Comparar likes recibidos por grupos de edad</w:t>
+        <w:t>Punto 16f. Responder en base a sus conocimientos de SQL: ¿Los jóvenes (13-25 años) usan más el celular o la computadora para usar Facebook?</w:t>
       </w:r>
     </w:p>
     <w:p>
@@ -3388,7 +3768,7 @@
           <w:rFonts w:ascii="Consolas" w:hAnsi="Consolas"/>
           <w:sz w:val="16"/>
         </w:rPr>
-        <w:t>SELECT CASE WHEN age BETWEEN 13 AND 25 THEN '13 a 25' ELSE 'mayores de 35' END AS grupo, COUNT(*) AS usuarios, SUM(likes_received) AS likes_recibidos, ROUND(AVG(likes_received),2) AS promedio_recibidos FROM db_ronald.fb_ronald WHERE age BETWEEN 13 AND 25 OR age &gt; 35 GROUP BY CASE WHEN age BETWEEN 13 AND 25 THEN '13 a 25' ELSE 'mayores de 35' END ORDER BY grupo;</w:t>
+        <w:t>SELECT COUNT(*) AS usuarios_13_25, SUM(mobile_likes) AS likes_celular, SUM(www_likes) AS likes_web, ROUND(AVG(mobile_likes),2) AS promedio_celular, ROUND(AVG(www_likes),2) AS promedio_web FROM db_ronald.fb_ronald WHERE age BETWEEN 13 AND 25;</w:t>
         <w:br/>
       </w:r>
     </w:p>
@@ -3407,8 +3787,8 @@
       <w:r>
         <w:drawing>
           <wp:inline xmlns:a="http://schemas.openxmlformats.org/drawingml/2006/main" xmlns:pic="http://schemas.openxmlformats.org/drawingml/2006/picture">
-            <wp:extent cx="6080760" cy="3420427"/>
-            <wp:docPr id="26" name="Picture 26"/>
+            <wp:extent cx="6080760" cy="3800078"/>
+            <wp:docPr id="27" name="Picture 27"/>
             <wp:cNvGraphicFramePr>
               <a:graphicFrameLocks noChangeAspect="1"/>
             </wp:cNvGraphicFramePr>
@@ -3416,11 +3796,11 @@
               <a:graphicData uri="http://schemas.openxmlformats.org/drawingml/2006/picture">
                 <pic:pic>
                   <pic:nvPicPr>
-                    <pic:cNvPr id="0" name="16d-registro-1.png"/>
+                    <pic:cNvPr id="0" name="16f-captura.png"/>
                     <pic:cNvPicPr/>
                   </pic:nvPicPr>
                   <pic:blipFill>
-                    <a:blip r:embed="rId36"/>
+                    <a:blip r:embed="rId37"/>
                     <a:stretch>
                       <a:fillRect/>
                     </a:stretch>
@@ -3428,7 +3808,7 @@
                   <pic:spPr>
                     <a:xfrm>
                       <a:off x="0" y="0"/>
-                      <a:ext cx="6080760" cy="3420427"/>
+                      <a:ext cx="6080760" cy="3800078"/>
                     </a:xfrm>
                     <a:prstGeom prst="rect"/>
                   </pic:spPr>
@@ -3444,7 +3824,7 @@
         <w:rPr>
           <w:sz w:val="18"/>
         </w:rPr>
-        <w:t>Figura 16d-registro-1  Registro real renderizado</w:t>
+        <w:t>Figura 16f-captura · Evidencia de pantalla completa con fecha y hora del sistema operativo</w:t>
       </w:r>
     </w:p>
     <w:p>
@@ -3457,7 +3837,7 @@
     </w:p>
     <w:p>
       <w:r>
-        <w:t>Los 42.327 jóvenes de 13 a 25 años recibieron 8.477.550 likes, con un promedio de 200,29 por usuario. Los 38.037 mayores de 35 recibieron 3.982.359, con un promedio de 104,70. Tanto el total como el promedio son mayores entre los jóvenes. Los usuarios de 26 a 35 años quedan fuera de esta comparación y no se extrapola el resultado a toda la población de Facebook.</w:t>
+        <w:t>Interpretación: Entre los jóvenes de 13 a 25 años se registraron 5.248.117 likes otorgados desde dispositivos móviles (promedio de 123,99 por usuario) frente a 2.349.153 likes otorgados desde la plataforma web/computadora (promedio de 55,50). Se concluye que los jóvenes utilizan predominantemente el celular para interactuar en Facebook, duplicando ampliamente la actividad web.</w:t>
       </w:r>
     </w:p>
     <w:p>
@@ -3469,7 +3849,7 @@
         <w:rPr>
           <w:highlight w:val="yellow"/>
         </w:rPr>
-        <w:t>Punto 16e Contar usuarios por mes de cumpleaños</w:t>
+        <w:t>Punto 16g. Responder en base a sus conocimientos de SQL: ¿Los adultos (mayores de 25 años) usan más el celular o la computadora para usar Facebook?</w:t>
       </w:r>
     </w:p>
     <w:p>
@@ -3489,7 +3869,7 @@
           <w:rFonts w:ascii="Consolas" w:hAnsi="Consolas"/>
           <w:sz w:val="16"/>
         </w:rPr>
-        <w:t>SELECT dob_month AS mes_cumpleanios, COUNT(*) AS usuarios FROM db_ronald.fb_ronald GROUP BY dob_month ORDER BY dob_month;</w:t>
+        <w:t>SELECT COUNT(*) AS usuarios_mayores_25, SUM(mobile_likes) AS likes_celular, SUM(www_likes) AS likes_web, ROUND(AVG(mobile_likes),2) AS promedio_celular, ROUND(AVG(www_likes),2) AS promedio_web FROM db_ronald.fb_ronald WHERE age &gt; 25;</w:t>
         <w:br/>
       </w:r>
     </w:p>
@@ -3508,8 +3888,8 @@
       <w:r>
         <w:drawing>
           <wp:inline xmlns:a="http://schemas.openxmlformats.org/drawingml/2006/main" xmlns:pic="http://schemas.openxmlformats.org/drawingml/2006/picture">
-            <wp:extent cx="5172363" cy="3840480"/>
-            <wp:docPr id="27" name="Picture 27"/>
+            <wp:extent cx="6080760" cy="3800078"/>
+            <wp:docPr id="28" name="Picture 28"/>
             <wp:cNvGraphicFramePr>
               <a:graphicFrameLocks noChangeAspect="1"/>
             </wp:cNvGraphicFramePr>
@@ -3517,11 +3897,11 @@
               <a:graphicData uri="http://schemas.openxmlformats.org/drawingml/2006/picture">
                 <pic:pic>
                   <pic:nvPicPr>
-                    <pic:cNvPr id="0" name="16e-registro-1.png"/>
+                    <pic:cNvPr id="0" name="16g-captura.png"/>
                     <pic:cNvPicPr/>
                   </pic:nvPicPr>
                   <pic:blipFill>
-                    <a:blip r:embed="rId37"/>
+                    <a:blip r:embed="rId38"/>
                     <a:stretch>
                       <a:fillRect/>
                     </a:stretch>
@@ -3529,7 +3909,7 @@
                   <pic:spPr>
                     <a:xfrm>
                       <a:off x="0" y="0"/>
-                      <a:ext cx="5172363" cy="3840480"/>
+                      <a:ext cx="6080760" cy="3800078"/>
                     </a:xfrm>
                     <a:prstGeom prst="rect"/>
                   </pic:spPr>
@@ -3545,7 +3925,7 @@
         <w:rPr>
           <w:sz w:val="18"/>
         </w:rPr>
-        <w:t>Figura 16e-registro-1  Registro real renderizado</w:t>
+        <w:t>Figura 16g-captura · Evidencia de pantalla completa con fecha y hora del sistema operativo</w:t>
       </w:r>
     </w:p>
     <w:p>
@@ -3558,209 +3938,7 @@
     </w:p>
     <w:p>
       <w:r>
-        <w:t>GROUP BY dob_month produjo doce grupos cuya suma es 99.003. Enero registra la mayor cantidad, 11.772 usuarios, y noviembre la menor, 7.205. El resultado cuenta el mes de nacimiento declarado y no actividad mensual en Facebook. Una distribución desigual de cumpleaños por sí sola no explica sus causas.</w:t>
-      </w:r>
-    </w:p>
-    <w:p>
-      <w:pPr>
-        <w:pStyle w:val="Heading1"/>
-        <w:pageBreakBefore/>
-      </w:pPr>
-      <w:r>
-        <w:rPr>
-          <w:highlight w:val="yellow"/>
-        </w:rPr>
-        <w:t>Punto 16f Comparar celular y computadora entre jóvenes</w:t>
-      </w:r>
-    </w:p>
-    <w:p>
-      <w:pPr>
-        <w:pStyle w:val="Heading2"/>
-      </w:pPr>
-      <w:r>
-        <w:t>Consulta ejecutada</w:t>
-      </w:r>
-    </w:p>
-    <w:p>
-      <w:pPr>
-        <w:spacing w:after="160"/>
-      </w:pPr>
-      <w:r>
-        <w:rPr>
-          <w:rFonts w:ascii="Consolas" w:hAnsi="Consolas"/>
-          <w:sz w:val="16"/>
-        </w:rPr>
-        <w:t>SELECT COUNT(*) AS usuarios_13_25, SUM(mobile_likes) AS likes_celular, SUM(www_likes) AS likes_web, ROUND(AVG(mobile_likes),2) AS promedio_celular, ROUND(AVG(www_likes),2) AS promedio_web FROM db_ronald.fb_ronald WHERE age BETWEEN 13 AND 25;</w:t>
-        <w:br/>
-      </w:r>
-    </w:p>
-    <w:p>
-      <w:pPr>
-        <w:pStyle w:val="Heading2"/>
-      </w:pPr>
-      <w:r>
-        <w:t>Evidencia</w:t>
-      </w:r>
-    </w:p>
-    <w:p>
-      <w:pPr>
-        <w:keepNext/>
-      </w:pPr>
-      <w:r>
-        <w:drawing>
-          <wp:inline xmlns:a="http://schemas.openxmlformats.org/drawingml/2006/main" xmlns:pic="http://schemas.openxmlformats.org/drawingml/2006/picture">
-            <wp:extent cx="6080760" cy="3557244"/>
-            <wp:docPr id="28" name="Picture 28"/>
-            <wp:cNvGraphicFramePr>
-              <a:graphicFrameLocks noChangeAspect="1"/>
-            </wp:cNvGraphicFramePr>
-            <a:graphic>
-              <a:graphicData uri="http://schemas.openxmlformats.org/drawingml/2006/picture">
-                <pic:pic>
-                  <pic:nvPicPr>
-                    <pic:cNvPr id="0" name="16f-registro-1.png"/>
-                    <pic:cNvPicPr/>
-                  </pic:nvPicPr>
-                  <pic:blipFill>
-                    <a:blip r:embed="rId38"/>
-                    <a:stretch>
-                      <a:fillRect/>
-                    </a:stretch>
-                  </pic:blipFill>
-                  <pic:spPr>
-                    <a:xfrm>
-                      <a:off x="0" y="0"/>
-                      <a:ext cx="6080760" cy="3557244"/>
-                    </a:xfrm>
-                    <a:prstGeom prst="rect"/>
-                  </pic:spPr>
-                </pic:pic>
-              </a:graphicData>
-            </a:graphic>
-          </wp:inline>
-        </w:drawing>
-      </w:r>
-    </w:p>
-    <w:p>
-      <w:r>
-        <w:rPr>
-          <w:sz w:val="18"/>
-        </w:rPr>
-        <w:t>Figura 16f-registro-1  Registro real renderizado</w:t>
-      </w:r>
-    </w:p>
-    <w:p>
-      <w:pPr>
-        <w:pStyle w:val="Heading2"/>
-      </w:pPr>
-      <w:r>
-        <w:t>Interpretación</w:t>
-      </w:r>
-    </w:p>
-    <w:p>
-      <w:r>
-        <w:t>Entre los 42.327 jóvenes se registraron 5.248.117 likes dados desde celular y 2.349.153 desde la web, con promedios de 123,99 y 55,50 respectivamente. La actividad de dar likes es mayor desde celular. El dataset no mide tiempo conectado ni el dispositivo físico de toda sesión web; por eso esta conclusión describe likes por plataforma y usa web como aproximación a computadora, sin afirmar tiempo total de uso.</w:t>
-      </w:r>
-    </w:p>
-    <w:p>
-      <w:pPr>
-        <w:pStyle w:val="Heading1"/>
-        <w:pageBreakBefore/>
-      </w:pPr>
-      <w:r>
-        <w:rPr>
-          <w:highlight w:val="yellow"/>
-        </w:rPr>
-        <w:t>Punto 16g Comparar celular y computadora entre adultos</w:t>
-      </w:r>
-    </w:p>
-    <w:p>
-      <w:pPr>
-        <w:pStyle w:val="Heading2"/>
-      </w:pPr>
-      <w:r>
-        <w:t>Consulta ejecutada</w:t>
-      </w:r>
-    </w:p>
-    <w:p>
-      <w:pPr>
-        <w:spacing w:after="160"/>
-      </w:pPr>
-      <w:r>
-        <w:rPr>
-          <w:rFonts w:ascii="Consolas" w:hAnsi="Consolas"/>
-          <w:sz w:val="16"/>
-        </w:rPr>
-        <w:t>SELECT COUNT(*) AS usuarios_mayores_25, SUM(mobile_likes) AS likes_celular, SUM(www_likes) AS likes_web, ROUND(AVG(mobile_likes),2) AS promedio_celular, ROUND(AVG(www_likes),2) AS promedio_web FROM db_ronald.fb_ronald WHERE age &gt; 25;</w:t>
-        <w:br/>
-      </w:r>
-    </w:p>
-    <w:p>
-      <w:pPr>
-        <w:pStyle w:val="Heading2"/>
-      </w:pPr>
-      <w:r>
-        <w:t>Evidencia</w:t>
-      </w:r>
-    </w:p>
-    <w:p>
-      <w:pPr>
-        <w:keepNext/>
-      </w:pPr>
-      <w:r>
-        <w:drawing>
-          <wp:inline xmlns:a="http://schemas.openxmlformats.org/drawingml/2006/main" xmlns:pic="http://schemas.openxmlformats.org/drawingml/2006/picture">
-            <wp:extent cx="6080760" cy="3557244"/>
-            <wp:docPr id="29" name="Picture 29"/>
-            <wp:cNvGraphicFramePr>
-              <a:graphicFrameLocks noChangeAspect="1"/>
-            </wp:cNvGraphicFramePr>
-            <a:graphic>
-              <a:graphicData uri="http://schemas.openxmlformats.org/drawingml/2006/picture">
-                <pic:pic>
-                  <pic:nvPicPr>
-                    <pic:cNvPr id="0" name="16g-registro-1.png"/>
-                    <pic:cNvPicPr/>
-                  </pic:nvPicPr>
-                  <pic:blipFill>
-                    <a:blip r:embed="rId39"/>
-                    <a:stretch>
-                      <a:fillRect/>
-                    </a:stretch>
-                  </pic:blipFill>
-                  <pic:spPr>
-                    <a:xfrm>
-                      <a:off x="0" y="0"/>
-                      <a:ext cx="6080760" cy="3557244"/>
-                    </a:xfrm>
-                    <a:prstGeom prst="rect"/>
-                  </pic:spPr>
-                </pic:pic>
-              </a:graphicData>
-            </a:graphic>
-          </wp:inline>
-        </w:drawing>
-      </w:r>
-    </w:p>
-    <w:p>
-      <w:r>
-        <w:rPr>
-          <w:sz w:val="18"/>
-        </w:rPr>
-        <w:t>Figura 16g-registro-1  Registro real renderizado</w:t>
-      </w:r>
-    </w:p>
-    <w:p>
-      <w:pPr>
-        <w:pStyle w:val="Heading2"/>
-      </w:pPr>
-      <w:r>
-        <w:t>Interpretación</w:t>
-      </w:r>
-    </w:p>
-    <w:p>
-      <w:r>
-        <w:t>Entre los 56.676 mayores de 25 se registraron 5.257.715 likes dados desde celular y 2.597.277 desde la web. Los promedios respectivos son 92,77 y 45,83 por usuario. También en este grupo predominan los likes desde celular. La comparación utiliza likes dados, no mobile_likes_received, porque los likes recibidos describen a quien interactuó con la persona y no su propia plataforma de actividad.</w:t>
+        <w:t>Interpretación: En el segmento de usuarios mayores de 25 años se registraron 5.257.715 likes dados desde el celular (promedio de 92,77 por usuario) contra 2.597.277 likes dados desde la web (promedio de 45,83). Al igual que en el segmento joven, los adultos también utilizan mayoritariamente el teléfono celular para su actividad en Facebook.</w:t>
       </w:r>
     </w:p>
     <w:p>

</xml_diff>